<commit_message>
feat: agrega el banco de preguntas general con filtros, buscador y edición por pregunta
Vista de todas las preguntas de todos los cursos para administrador, supervisor y consulta gerencial;
el administrador edita una pregunta suelta conservando el historial de respuestas. Manual actualizado.

Co-Authored-By: Claude Opus 5.5 <noreply@anthropic.com>
</commit_message>
<xml_diff>
--- a/docs/Manual_de_usuario_Hercules_Control_v1.0.0.docx
+++ b/docs/Manual_de_usuario_Hercules_Control_v1.0.0.docx
@@ -12,7 +12,7 @@
           <w:noProof/>
         </w:rPr>
         <w:drawing>
-          <wp:inline distT="0" distB="0" distL="0" distR="0" wp14:anchorId="74ECC1C7" wp14:editId="39D2F065">
+          <wp:inline distT="0" distB="0" distL="0" distR="0" wp14:anchorId="710232B0" wp14:editId="7C5F7635">
             <wp:extent cx="1809750" cy="1809750"/>
             <wp:effectExtent l="0" t="0" r="0" b="0"/>
             <wp:docPr id="1" name="logo" descr="Escudo de Hércules Control" title="Logo"/>
@@ -145,7 +145,7 @@
     <w:sdt>
       <w:sdtPr>
         <w:alias w:val="Contenido"/>
-        <w:id w:val="-1892482877"/>
+        <w:id w:val="184488994"/>
       </w:sdtPr>
       <w:sdtEndPr/>
       <w:sdtContent>
@@ -168,7 +168,7 @@
           <w:r>
             <w:fldChar w:fldCharType="separate"/>
           </w:r>
-          <w:hyperlink w:anchor="_Toc242803868" w:history="1">
+          <w:hyperlink w:anchor="_Toc242805098" w:history="1">
             <w:r>
               <w:rPr>
                 <w:rStyle w:val="Hipervnculo"/>
@@ -192,7 +192,7 @@
               <w:rPr>
                 <w:noProof/>
               </w:rPr>
-              <w:instrText xml:space="preserve"> PAGEREF _Toc242803868 \h </w:instrText>
+              <w:instrText xml:space="preserve"> PAGEREF _Toc242805098 \h </w:instrText>
             </w:r>
             <w:r>
               <w:rPr>
@@ -229,7 +229,7 @@
               <w:noProof/>
             </w:rPr>
           </w:pPr>
-          <w:hyperlink w:anchor="_Toc242803869" w:history="1">
+          <w:hyperlink w:anchor="_Toc242805099" w:history="1">
             <w:r>
               <w:rPr>
                 <w:rStyle w:val="Hipervnculo"/>
@@ -253,7 +253,7 @@
               <w:rPr>
                 <w:noProof/>
               </w:rPr>
-              <w:instrText xml:space="preserve"> PAGEREF _Toc242803869 \h </w:instrText>
+              <w:instrText xml:space="preserve"> PAGEREF _Toc242805099 \h </w:instrText>
             </w:r>
             <w:r>
               <w:rPr>
@@ -290,7 +290,7 @@
               <w:noProof/>
             </w:rPr>
           </w:pPr>
-          <w:hyperlink w:anchor="_Toc242803870" w:history="1">
+          <w:hyperlink w:anchor="_Toc242805100" w:history="1">
             <w:r>
               <w:rPr>
                 <w:rStyle w:val="Hipervnculo"/>
@@ -314,7 +314,7 @@
               <w:rPr>
                 <w:noProof/>
               </w:rPr>
-              <w:instrText xml:space="preserve"> PAGEREF _Toc242803870 \h </w:instrText>
+              <w:instrText xml:space="preserve"> PAGEREF _Toc242805100 \h </w:instrText>
             </w:r>
             <w:r>
               <w:rPr>
@@ -351,7 +351,7 @@
               <w:noProof/>
             </w:rPr>
           </w:pPr>
-          <w:hyperlink w:anchor="_Toc242803871" w:history="1">
+          <w:hyperlink w:anchor="_Toc242805101" w:history="1">
             <w:r>
               <w:rPr>
                 <w:rStyle w:val="Hipervnculo"/>
@@ -375,7 +375,7 @@
               <w:rPr>
                 <w:noProof/>
               </w:rPr>
-              <w:instrText xml:space="preserve"> PAGEREF _Toc242803871 \h </w:instrText>
+              <w:instrText xml:space="preserve"> PAGEREF _Toc242805101 \h </w:instrText>
             </w:r>
             <w:r>
               <w:rPr>
@@ -412,7 +412,7 @@
               <w:noProof/>
             </w:rPr>
           </w:pPr>
-          <w:hyperlink w:anchor="_Toc242803872" w:history="1">
+          <w:hyperlink w:anchor="_Toc242805102" w:history="1">
             <w:r>
               <w:rPr>
                 <w:rStyle w:val="Hipervnculo"/>
@@ -436,7 +436,7 @@
               <w:rPr>
                 <w:noProof/>
               </w:rPr>
-              <w:instrText xml:space="preserve"> PAGEREF _Toc242803872 \h </w:instrText>
+              <w:instrText xml:space="preserve"> PAGEREF _Toc242805102 \h </w:instrText>
             </w:r>
             <w:r>
               <w:rPr>
@@ -473,7 +473,7 @@
               <w:noProof/>
             </w:rPr>
           </w:pPr>
-          <w:hyperlink w:anchor="_Toc242803873" w:history="1">
+          <w:hyperlink w:anchor="_Toc242805103" w:history="1">
             <w:r>
               <w:rPr>
                 <w:rStyle w:val="Hipervnculo"/>
@@ -497,7 +497,7 @@
               <w:rPr>
                 <w:noProof/>
               </w:rPr>
-              <w:instrText xml:space="preserve"> PAGEREF _Toc242803873 \h </w:instrText>
+              <w:instrText xml:space="preserve"> PAGEREF _Toc242805103 \h </w:instrText>
             </w:r>
             <w:r>
               <w:rPr>
@@ -534,7 +534,7 @@
               <w:noProof/>
             </w:rPr>
           </w:pPr>
-          <w:hyperlink w:anchor="_Toc242803874" w:history="1">
+          <w:hyperlink w:anchor="_Toc242805104" w:history="1">
             <w:r>
               <w:rPr>
                 <w:rStyle w:val="Hipervnculo"/>
@@ -558,7 +558,7 @@
               <w:rPr>
                 <w:noProof/>
               </w:rPr>
-              <w:instrText xml:space="preserve"> PAGEREF _Toc242803874 \h </w:instrText>
+              <w:instrText xml:space="preserve"> PAGEREF _Toc242805104 \h </w:instrText>
             </w:r>
             <w:r>
               <w:rPr>
@@ -595,7 +595,7 @@
               <w:noProof/>
             </w:rPr>
           </w:pPr>
-          <w:hyperlink w:anchor="_Toc242803875" w:history="1">
+          <w:hyperlink w:anchor="_Toc242805105" w:history="1">
             <w:r>
               <w:rPr>
                 <w:rStyle w:val="Hipervnculo"/>
@@ -619,7 +619,7 @@
               <w:rPr>
                 <w:noProof/>
               </w:rPr>
-              <w:instrText xml:space="preserve"> PAGEREF _Toc242803875 \h </w:instrText>
+              <w:instrText xml:space="preserve"> PAGEREF _Toc242805105 \h </w:instrText>
             </w:r>
             <w:r>
               <w:rPr>
@@ -656,7 +656,7 @@
               <w:noProof/>
             </w:rPr>
           </w:pPr>
-          <w:hyperlink w:anchor="_Toc242803876" w:history="1">
+          <w:hyperlink w:anchor="_Toc242805106" w:history="1">
             <w:r>
               <w:rPr>
                 <w:rStyle w:val="Hipervnculo"/>
@@ -680,7 +680,7 @@
               <w:rPr>
                 <w:noProof/>
               </w:rPr>
-              <w:instrText xml:space="preserve"> PAGEREF _Toc242803876 \h </w:instrText>
+              <w:instrText xml:space="preserve"> PAGEREF _Toc242805106 \h </w:instrText>
             </w:r>
             <w:r>
               <w:rPr>
@@ -717,7 +717,7 @@
               <w:noProof/>
             </w:rPr>
           </w:pPr>
-          <w:hyperlink w:anchor="_Toc242803877" w:history="1">
+          <w:hyperlink w:anchor="_Toc242805107" w:history="1">
             <w:r>
               <w:rPr>
                 <w:rStyle w:val="Hipervnculo"/>
@@ -741,7 +741,7 @@
               <w:rPr>
                 <w:noProof/>
               </w:rPr>
-              <w:instrText xml:space="preserve"> PAGEREF _Toc242803877 \h </w:instrText>
+              <w:instrText xml:space="preserve"> PAGEREF _Toc242805107 \h </w:instrText>
             </w:r>
             <w:r>
               <w:rPr>
@@ -778,7 +778,7 @@
               <w:noProof/>
             </w:rPr>
           </w:pPr>
-          <w:hyperlink w:anchor="_Toc242803878" w:history="1">
+          <w:hyperlink w:anchor="_Toc242805108" w:history="1">
             <w:r>
               <w:rPr>
                 <w:rStyle w:val="Hipervnculo"/>
@@ -802,7 +802,7 @@
               <w:rPr>
                 <w:noProof/>
               </w:rPr>
-              <w:instrText xml:space="preserve"> PAGEREF _Toc242803878 \h </w:instrText>
+              <w:instrText xml:space="preserve"> PAGEREF _Toc242805108 \h </w:instrText>
             </w:r>
             <w:r>
               <w:rPr>
@@ -839,7 +839,7 @@
               <w:noProof/>
             </w:rPr>
           </w:pPr>
-          <w:hyperlink w:anchor="_Toc242803879" w:history="1">
+          <w:hyperlink w:anchor="_Toc242805109" w:history="1">
             <w:r>
               <w:rPr>
                 <w:rStyle w:val="Hipervnculo"/>
@@ -863,7 +863,7 @@
               <w:rPr>
                 <w:noProof/>
               </w:rPr>
-              <w:instrText xml:space="preserve"> PAGEREF _Toc242803879 \h </w:instrText>
+              <w:instrText xml:space="preserve"> PAGEREF _Toc242805109 \h </w:instrText>
             </w:r>
             <w:r>
               <w:rPr>
@@ -900,7 +900,7 @@
               <w:noProof/>
             </w:rPr>
           </w:pPr>
-          <w:hyperlink w:anchor="_Toc242803880" w:history="1">
+          <w:hyperlink w:anchor="_Toc242805110" w:history="1">
             <w:r>
               <w:rPr>
                 <w:rStyle w:val="Hipervnculo"/>
@@ -924,7 +924,7 @@
               <w:rPr>
                 <w:noProof/>
               </w:rPr>
-              <w:instrText xml:space="preserve"> PAGEREF _Toc242803880 \h </w:instrText>
+              <w:instrText xml:space="preserve"> PAGEREF _Toc242805110 \h </w:instrText>
             </w:r>
             <w:r>
               <w:rPr>
@@ -961,13 +961,13 @@
               <w:noProof/>
             </w:rPr>
           </w:pPr>
-          <w:hyperlink w:anchor="_Toc242803881" w:history="1">
+          <w:hyperlink w:anchor="_Toc242805111" w:history="1">
             <w:r>
               <w:rPr>
                 <w:rStyle w:val="Hipervnculo"/>
                 <w:noProof/>
               </w:rPr>
-              <w:t>3.5 Avance de alumnos</w:t>
+              <w:t>3.5 Banco de preguntas general</w:t>
             </w:r>
             <w:r>
               <w:rPr>
@@ -985,7 +985,7 @@
               <w:rPr>
                 <w:noProof/>
               </w:rPr>
-              <w:instrText xml:space="preserve"> PAGEREF _Toc242803881 \h </w:instrText>
+              <w:instrText xml:space="preserve"> PAGEREF _Toc242805111 \h </w:instrText>
             </w:r>
             <w:r>
               <w:rPr>
@@ -1003,6 +1003,67 @@
                 <w:noProof/>
               </w:rPr>
               <w:t>12</w:t>
+            </w:r>
+            <w:r>
+              <w:rPr>
+                <w:noProof/>
+              </w:rPr>
+              <w:fldChar w:fldCharType="end"/>
+            </w:r>
+          </w:hyperlink>
+        </w:p>
+        <w:p>
+          <w:pPr>
+            <w:pStyle w:val="TDC2"/>
+            <w:tabs>
+              <w:tab w:val="right" w:leader="dot" w:pos="9016"/>
+            </w:tabs>
+            <w:rPr>
+              <w:noProof/>
+            </w:rPr>
+          </w:pPr>
+          <w:hyperlink w:anchor="_Toc242805112" w:history="1">
+            <w:r>
+              <w:rPr>
+                <w:rStyle w:val="Hipervnculo"/>
+                <w:noProof/>
+              </w:rPr>
+              <w:t>3.6 Avance de alumnos</w:t>
+            </w:r>
+            <w:r>
+              <w:rPr>
+                <w:noProof/>
+              </w:rPr>
+              <w:tab/>
+            </w:r>
+            <w:r>
+              <w:rPr>
+                <w:noProof/>
+              </w:rPr>
+              <w:fldChar w:fldCharType="begin"/>
+            </w:r>
+            <w:r>
+              <w:rPr>
+                <w:noProof/>
+              </w:rPr>
+              <w:instrText xml:space="preserve"> PAGEREF _Toc242805112 \h </w:instrText>
+            </w:r>
+            <w:r>
+              <w:rPr>
+                <w:noProof/>
+              </w:rPr>
+            </w:r>
+            <w:r>
+              <w:rPr>
+                <w:noProof/>
+              </w:rPr>
+              <w:fldChar w:fldCharType="separate"/>
+            </w:r>
+            <w:r>
+              <w:rPr>
+                <w:noProof/>
+              </w:rPr>
+              <w:t>13</w:t>
             </w:r>
             <w:r>
               <w:rPr>
@@ -1022,7 +1083,7 @@
               <w:noProof/>
             </w:rPr>
           </w:pPr>
-          <w:hyperlink w:anchor="_Toc242803882" w:history="1">
+          <w:hyperlink w:anchor="_Toc242805113" w:history="1">
             <w:r>
               <w:rPr>
                 <w:rStyle w:val="Hipervnculo"/>
@@ -1046,7 +1107,7 @@
               <w:rPr>
                 <w:noProof/>
               </w:rPr>
-              <w:instrText xml:space="preserve"> PAGEREF _Toc242803882 \h </w:instrText>
+              <w:instrText xml:space="preserve"> PAGEREF _Toc242805113 \h </w:instrText>
             </w:r>
             <w:r>
               <w:rPr>
@@ -1063,7 +1124,7 @@
               <w:rPr>
                 <w:noProof/>
               </w:rPr>
-              <w:t>13</w:t>
+              <w:t>14</w:t>
             </w:r>
             <w:r>
               <w:rPr>
@@ -1083,7 +1144,7 @@
               <w:noProof/>
             </w:rPr>
           </w:pPr>
-          <w:hyperlink w:anchor="_Toc242803883" w:history="1">
+          <w:hyperlink w:anchor="_Toc242805114" w:history="1">
             <w:r>
               <w:rPr>
                 <w:rStyle w:val="Hipervnculo"/>
@@ -1107,7 +1168,7 @@
               <w:rPr>
                 <w:noProof/>
               </w:rPr>
-              <w:instrText xml:space="preserve"> PAGEREF _Toc242803883 \h </w:instrText>
+              <w:instrText xml:space="preserve"> PAGEREF _Toc242805114 \h </w:instrText>
             </w:r>
             <w:r>
               <w:rPr>
@@ -1124,7 +1185,7 @@
               <w:rPr>
                 <w:noProof/>
               </w:rPr>
-              <w:t>13</w:t>
+              <w:t>14</w:t>
             </w:r>
             <w:r>
               <w:rPr>
@@ -1144,12 +1205,73 @@
               <w:noProof/>
             </w:rPr>
           </w:pPr>
-          <w:hyperlink w:anchor="_Toc242803884" w:history="1">
+          <w:hyperlink w:anchor="_Toc242805115" w:history="1">
             <w:r>
               <w:rPr>
                 <w:rStyle w:val="Hipervnculo"/>
                 <w:noProof/>
               </w:rPr>
+              <w:t>Banco de preguntas</w:t>
+            </w:r>
+            <w:r>
+              <w:rPr>
+                <w:noProof/>
+              </w:rPr>
+              <w:tab/>
+            </w:r>
+            <w:r>
+              <w:rPr>
+                <w:noProof/>
+              </w:rPr>
+              <w:fldChar w:fldCharType="begin"/>
+            </w:r>
+            <w:r>
+              <w:rPr>
+                <w:noProof/>
+              </w:rPr>
+              <w:instrText xml:space="preserve"> PAGEREF _Toc242805115 \h </w:instrText>
+            </w:r>
+            <w:r>
+              <w:rPr>
+                <w:noProof/>
+              </w:rPr>
+            </w:r>
+            <w:r>
+              <w:rPr>
+                <w:noProof/>
+              </w:rPr>
+              <w:fldChar w:fldCharType="separate"/>
+            </w:r>
+            <w:r>
+              <w:rPr>
+                <w:noProof/>
+              </w:rPr>
+              <w:t>14</w:t>
+            </w:r>
+            <w:r>
+              <w:rPr>
+                <w:noProof/>
+              </w:rPr>
+              <w:fldChar w:fldCharType="end"/>
+            </w:r>
+          </w:hyperlink>
+        </w:p>
+        <w:p>
+          <w:pPr>
+            <w:pStyle w:val="TDC2"/>
+            <w:tabs>
+              <w:tab w:val="right" w:leader="dot" w:pos="9016"/>
+            </w:tabs>
+            <w:rPr>
+              <w:noProof/>
+            </w:rPr>
+          </w:pPr>
+          <w:hyperlink w:anchor="_Toc242805116" w:history="1">
+            <w:r>
+              <w:rPr>
+                <w:rStyle w:val="Hipervnculo"/>
+                <w:noProof/>
+              </w:rPr>
               <w:t>Avance de alumnos</w:t>
             </w:r>
             <w:r>
@@ -1168,7 +1290,7 @@
               <w:rPr>
                 <w:noProof/>
               </w:rPr>
-              <w:instrText xml:space="preserve"> PAGEREF _Toc242803884 \h </w:instrText>
+              <w:instrText xml:space="preserve"> PAGEREF _Toc242805116 \h </w:instrText>
             </w:r>
             <w:r>
               <w:rPr>
@@ -1185,7 +1307,7 @@
               <w:rPr>
                 <w:noProof/>
               </w:rPr>
-              <w:t>13</w:t>
+              <w:t>14</w:t>
             </w:r>
             <w:r>
               <w:rPr>
@@ -1205,7 +1327,7 @@
               <w:noProof/>
             </w:rPr>
           </w:pPr>
-          <w:hyperlink w:anchor="_Toc242803885" w:history="1">
+          <w:hyperlink w:anchor="_Toc242805117" w:history="1">
             <w:r>
               <w:rPr>
                 <w:rStyle w:val="Hipervnculo"/>
@@ -1229,7 +1351,7 @@
               <w:rPr>
                 <w:noProof/>
               </w:rPr>
-              <w:instrText xml:space="preserve"> PAGEREF _Toc242803885 \h </w:instrText>
+              <w:instrText xml:space="preserve"> PAGEREF _Toc242805117 \h </w:instrText>
             </w:r>
             <w:r>
               <w:rPr>
@@ -1246,7 +1368,7 @@
               <w:rPr>
                 <w:noProof/>
               </w:rPr>
-              <w:t>15</w:t>
+              <w:t>16</w:t>
             </w:r>
             <w:r>
               <w:rPr>
@@ -1266,7 +1388,7 @@
               <w:noProof/>
             </w:rPr>
           </w:pPr>
-          <w:hyperlink w:anchor="_Toc242803886" w:history="1">
+          <w:hyperlink w:anchor="_Toc242805118" w:history="1">
             <w:r>
               <w:rPr>
                 <w:rStyle w:val="Hipervnculo"/>
@@ -1290,7 +1412,7 @@
               <w:rPr>
                 <w:noProof/>
               </w:rPr>
-              <w:instrText xml:space="preserve"> PAGEREF _Toc242803886 \h </w:instrText>
+              <w:instrText xml:space="preserve"> PAGEREF _Toc242805118 \h </w:instrText>
             </w:r>
             <w:r>
               <w:rPr>
@@ -1307,7 +1429,7 @@
               <w:rPr>
                 <w:noProof/>
               </w:rPr>
-              <w:t>16</w:t>
+              <w:t>17</w:t>
             </w:r>
             <w:r>
               <w:rPr>
@@ -1327,7 +1449,7 @@
               <w:noProof/>
             </w:rPr>
           </w:pPr>
-          <w:hyperlink w:anchor="_Toc242803887" w:history="1">
+          <w:hyperlink w:anchor="_Toc242805119" w:history="1">
             <w:r>
               <w:rPr>
                 <w:rStyle w:val="Hipervnculo"/>
@@ -1351,7 +1473,7 @@
               <w:rPr>
                 <w:noProof/>
               </w:rPr>
-              <w:instrText xml:space="preserve"> PAGEREF _Toc242803887 \h </w:instrText>
+              <w:instrText xml:space="preserve"> PAGEREF _Toc242805119 \h </w:instrText>
             </w:r>
             <w:r>
               <w:rPr>
@@ -1368,7 +1490,7 @@
               <w:rPr>
                 <w:noProof/>
               </w:rPr>
-              <w:t>17</w:t>
+              <w:t>18</w:t>
             </w:r>
             <w:r>
               <w:rPr>
@@ -1388,7 +1510,7 @@
               <w:noProof/>
             </w:rPr>
           </w:pPr>
-          <w:hyperlink w:anchor="_Toc242803888" w:history="1">
+          <w:hyperlink w:anchor="_Toc242805120" w:history="1">
             <w:r>
               <w:rPr>
                 <w:rStyle w:val="Hipervnculo"/>
@@ -1412,7 +1534,7 @@
               <w:rPr>
                 <w:noProof/>
               </w:rPr>
-              <w:instrText xml:space="preserve"> PAGEREF _Toc242803888 \h </w:instrText>
+              <w:instrText xml:space="preserve"> PAGEREF _Toc242805120 \h </w:instrText>
             </w:r>
             <w:r>
               <w:rPr>
@@ -1429,7 +1551,7 @@
               <w:rPr>
                 <w:noProof/>
               </w:rPr>
-              <w:t>17</w:t>
+              <w:t>18</w:t>
             </w:r>
             <w:r>
               <w:rPr>
@@ -1449,7 +1571,7 @@
               <w:noProof/>
             </w:rPr>
           </w:pPr>
-          <w:hyperlink w:anchor="_Toc242803889" w:history="1">
+          <w:hyperlink w:anchor="_Toc242805121" w:history="1">
             <w:r>
               <w:rPr>
                 <w:rStyle w:val="Hipervnculo"/>
@@ -1473,7 +1595,7 @@
               <w:rPr>
                 <w:noProof/>
               </w:rPr>
-              <w:instrText xml:space="preserve"> PAGEREF _Toc242803889 \h </w:instrText>
+              <w:instrText xml:space="preserve"> PAGEREF _Toc242805121 \h </w:instrText>
             </w:r>
             <w:r>
               <w:rPr>
@@ -1490,7 +1612,7 @@
               <w:rPr>
                 <w:noProof/>
               </w:rPr>
-              <w:t>17</w:t>
+              <w:t>18</w:t>
             </w:r>
             <w:r>
               <w:rPr>
@@ -1510,7 +1632,7 @@
               <w:noProof/>
             </w:rPr>
           </w:pPr>
-          <w:hyperlink w:anchor="_Toc242803890" w:history="1">
+          <w:hyperlink w:anchor="_Toc242805122" w:history="1">
             <w:r>
               <w:rPr>
                 <w:rStyle w:val="Hipervnculo"/>
@@ -1534,7 +1656,7 @@
               <w:rPr>
                 <w:noProof/>
               </w:rPr>
-              <w:instrText xml:space="preserve"> PAGEREF _Toc242803890 \h </w:instrText>
+              <w:instrText xml:space="preserve"> PAGEREF _Toc242805122 \h </w:instrText>
             </w:r>
             <w:r>
               <w:rPr>
@@ -1551,7 +1673,7 @@
               <w:rPr>
                 <w:noProof/>
               </w:rPr>
-              <w:t>18</w:t>
+              <w:t>19</w:t>
             </w:r>
             <w:r>
               <w:rPr>
@@ -1571,7 +1693,7 @@
               <w:noProof/>
             </w:rPr>
           </w:pPr>
-          <w:hyperlink w:anchor="_Toc242803891" w:history="1">
+          <w:hyperlink w:anchor="_Toc242805123" w:history="1">
             <w:r>
               <w:rPr>
                 <w:rStyle w:val="Hipervnculo"/>
@@ -1595,7 +1717,7 @@
               <w:rPr>
                 <w:noProof/>
               </w:rPr>
-              <w:instrText xml:space="preserve"> PAGEREF _Toc242803891 \h </w:instrText>
+              <w:instrText xml:space="preserve"> PAGEREF _Toc242805123 \h </w:instrText>
             </w:r>
             <w:r>
               <w:rPr>
@@ -1612,7 +1734,7 @@
               <w:rPr>
                 <w:noProof/>
               </w:rPr>
-              <w:t>19</w:t>
+              <w:t>20</w:t>
             </w:r>
             <w:r>
               <w:rPr>
@@ -1632,7 +1754,7 @@
               <w:noProof/>
             </w:rPr>
           </w:pPr>
-          <w:hyperlink w:anchor="_Toc242803892" w:history="1">
+          <w:hyperlink w:anchor="_Toc242805124" w:history="1">
             <w:r>
               <w:rPr>
                 <w:rStyle w:val="Hipervnculo"/>
@@ -1656,7 +1778,7 @@
               <w:rPr>
                 <w:noProof/>
               </w:rPr>
-              <w:instrText xml:space="preserve"> PAGEREF _Toc242803892 \h </w:instrText>
+              <w:instrText xml:space="preserve"> PAGEREF _Toc242805124 \h </w:instrText>
             </w:r>
             <w:r>
               <w:rPr>
@@ -1673,7 +1795,7 @@
               <w:rPr>
                 <w:noProof/>
               </w:rPr>
-              <w:t>20</w:t>
+              <w:t>21</w:t>
             </w:r>
             <w:r>
               <w:rPr>
@@ -1695,7 +1817,7 @@
         <w:pStyle w:val="Ttulo1"/>
         <w:pageBreakBefore/>
       </w:pPr>
-      <w:bookmarkStart w:id="0" w:name="_Toc242803868"/>
+      <w:bookmarkStart w:id="0" w:name="_Toc242805098"/>
       <w:r>
         <w:lastRenderedPageBreak/>
         <w:t>1. Qué es Hércules Control</w:t>
@@ -1762,7 +1884,7 @@
       <w:pPr>
         <w:pStyle w:val="Ttulo2"/>
       </w:pPr>
-      <w:bookmarkStart w:id="1" w:name="_Toc242803869"/>
+      <w:bookmarkStart w:id="1" w:name="_Toc242805099"/>
       <w:r>
         <w:t>Roles</w:t>
       </w:r>
@@ -2309,7 +2431,7 @@
       <w:pPr>
         <w:pStyle w:val="Ttulo2"/>
       </w:pPr>
-      <w:bookmarkStart w:id="2" w:name="_Toc242803870"/>
+      <w:bookmarkStart w:id="2" w:name="_Toc242805100"/>
       <w:r>
         <w:t>Qué necesitas</w:t>
       </w:r>
@@ -2359,7 +2481,7 @@
         <w:pStyle w:val="Ttulo1"/>
         <w:pageBreakBefore/>
       </w:pPr>
-      <w:bookmarkStart w:id="3" w:name="_Toc242803871"/>
+      <w:bookmarkStart w:id="3" w:name="_Toc242805101"/>
       <w:r>
         <w:lastRenderedPageBreak/>
         <w:t>2. Para todos los usuarios</w:t>
@@ -2370,7 +2492,7 @@
       <w:pPr>
         <w:pStyle w:val="Ttulo2"/>
       </w:pPr>
-      <w:bookmarkStart w:id="4" w:name="_Toc242803872"/>
+      <w:bookmarkStart w:id="4" w:name="_Toc242805102"/>
       <w:r>
         <w:t>Iniciar sesión</w:t>
       </w:r>
@@ -2455,7 +2577,7 @@
           <w:noProof/>
         </w:rPr>
         <w:drawing>
-          <wp:inline distT="0" distB="0" distL="0" distR="0" wp14:anchorId="6C5D2B54" wp14:editId="4D543126">
+          <wp:inline distT="0" distB="0" distL="0" distR="0" wp14:anchorId="7546BB39" wp14:editId="3589702B">
             <wp:extent cx="4953000" cy="2971800"/>
             <wp:effectExtent l="0" t="0" r="0" b="0"/>
             <wp:docPr id="2" name="00_login" descr="Figura 1. Pantalla de inicio de sesión." title="Figura 1. Pantalla de inicio de sesión."/>
@@ -2538,7 +2660,7 @@
           <w:noProof/>
         </w:rPr>
         <w:drawing>
-          <wp:inline distT="0" distB="0" distL="0" distR="0" wp14:anchorId="31EE4D8E" wp14:editId="1E2216C2">
+          <wp:inline distT="0" distB="0" distL="0" distR="0" wp14:anchorId="74A10233" wp14:editId="5FDE63E6">
             <wp:extent cx="4953000" cy="2971800"/>
             <wp:effectExtent l="0" t="0" r="0" b="0"/>
             <wp:docPr id="3" name="02_login_error" descr="Figura 2. Aviso cuando los datos no coinciden." title="Figura 2. Aviso cuando los datos no coinciden."/>
@@ -2615,7 +2737,7 @@
       <w:pPr>
         <w:pStyle w:val="Ttulo2"/>
       </w:pPr>
-      <w:bookmarkStart w:id="5" w:name="_Toc242803873"/>
+      <w:bookmarkStart w:id="5" w:name="_Toc242805103"/>
       <w:r>
         <w:t>El menú y tu panel de usuario</w:t>
       </w:r>
@@ -2701,7 +2823,7 @@
       <w:pPr>
         <w:pStyle w:val="Ttulo2"/>
       </w:pPr>
-      <w:bookmarkStart w:id="6" w:name="_Toc242803874"/>
+      <w:bookmarkStart w:id="6" w:name="_Toc242805104"/>
       <w:r>
         <w:t>Cambiar tu contraseña</w:t>
       </w:r>
@@ -2809,7 +2931,7 @@
           <w:noProof/>
         </w:rPr>
         <w:drawing>
-          <wp:inline distT="0" distB="0" distL="0" distR="0" wp14:anchorId="1CCFBF9C" wp14:editId="68F680D0">
+          <wp:inline distT="0" distB="0" distL="0" distR="0" wp14:anchorId="71AB54AE" wp14:editId="54DC8727">
             <wp:extent cx="4476750" cy="4095750"/>
             <wp:effectExtent l="0" t="0" r="0" b="0"/>
             <wp:docPr id="4" name="32_cambiar_clave" descr="Figura 3. Cambiar contraseña." title="Figura 3. Cambiar contraseña."/>
@@ -2868,7 +2990,7 @@
       <w:pPr>
         <w:pStyle w:val="Ttulo2"/>
       </w:pPr>
-      <w:bookmarkStart w:id="7" w:name="_Toc242803875"/>
+      <w:bookmarkStart w:id="7" w:name="_Toc242805105"/>
       <w:r>
         <w:t>Mensajes que puedes ver</w:t>
       </w:r>
@@ -3287,7 +3409,7 @@
         <w:pStyle w:val="Ttulo1"/>
         <w:pageBreakBefore/>
       </w:pPr>
-      <w:bookmarkStart w:id="8" w:name="_Toc242803876"/>
+      <w:bookmarkStart w:id="8" w:name="_Toc242805106"/>
       <w:r>
         <w:lastRenderedPageBreak/>
         <w:t>3. Administrador</w:t>
@@ -3326,7 +3448,7 @@
       <w:pPr>
         <w:pStyle w:val="Ttulo2"/>
       </w:pPr>
-      <w:bookmarkStart w:id="9" w:name="_Toc242803877"/>
+      <w:bookmarkStart w:id="9" w:name="_Toc242805107"/>
       <w:r>
         <w:t>3.1 Usuarios</w:t>
       </w:r>
@@ -3380,7 +3502,7 @@
           <w:noProof/>
         </w:rPr>
         <w:drawing>
-          <wp:inline distT="0" distB="0" distL="0" distR="0" wp14:anchorId="53B88DCB" wp14:editId="6A24839A">
+          <wp:inline distT="0" distB="0" distL="0" distR="0" wp14:anchorId="2B39CB65" wp14:editId="633CAE91">
             <wp:extent cx="5715000" cy="3429000"/>
             <wp:effectExtent l="0" t="0" r="0" b="0"/>
             <wp:docPr id="5" name="11_usuarios" descr="Figura 4. Lista de usuarios." title="Figura 4. Lista de usuarios."/>
@@ -3612,7 +3734,7 @@
         </w:rPr>
         <w:lastRenderedPageBreak/>
         <w:drawing>
-          <wp:inline distT="0" distB="0" distL="0" distR="0" wp14:anchorId="15D9A981" wp14:editId="5A486552">
+          <wp:inline distT="0" distB="0" distL="0" distR="0" wp14:anchorId="2A01D874" wp14:editId="23D9A393">
             <wp:extent cx="4476750" cy="4095750"/>
             <wp:effectExtent l="0" t="0" r="0" b="0"/>
             <wp:docPr id="6" name="31_nuevo_usuario" descr="Figura 5. Alta de un usuario." title="Figura 5. Alta de un usuario."/>
@@ -3746,7 +3868,7 @@
       <w:pPr>
         <w:pStyle w:val="Ttulo2"/>
       </w:pPr>
-      <w:bookmarkStart w:id="10" w:name="_Toc242803878"/>
+      <w:bookmarkStart w:id="10" w:name="_Toc242805108"/>
       <w:r>
         <w:t>3.2 Catálogo de cursos</w:t>
       </w:r>
@@ -3791,7 +3913,7 @@
         </w:rPr>
         <w:lastRenderedPageBreak/>
         <w:drawing>
-          <wp:inline distT="0" distB="0" distL="0" distR="0" wp14:anchorId="2663E21E" wp14:editId="60E65EE1">
+          <wp:inline distT="0" distB="0" distL="0" distR="0" wp14:anchorId="6F64F22D" wp14:editId="0EAB95E5">
             <wp:extent cx="5715000" cy="5086350"/>
             <wp:effectExtent l="0" t="0" r="0" b="0"/>
             <wp:docPr id="7" name="13_admin_catalogo_largo" descr="Figura 6. Catálogo y ficha de un curso." title="Figura 6. Catálogo y ficha de un curso."/>
@@ -4033,7 +4155,7 @@
       <w:pPr>
         <w:pStyle w:val="Ttulo2"/>
       </w:pPr>
-      <w:bookmarkStart w:id="11" w:name="_Toc242803879"/>
+      <w:bookmarkStart w:id="11" w:name="_Toc242805109"/>
       <w:r>
         <w:t>3.3 Crear o editar un curso</w:t>
       </w:r>
@@ -4078,7 +4200,7 @@
         </w:rPr>
         <w:lastRenderedPageBreak/>
         <w:drawing>
-          <wp:inline distT="0" distB="0" distL="0" distR="0" wp14:anchorId="00D2D09C" wp14:editId="32998F3E">
+          <wp:inline distT="0" distB="0" distL="0" distR="0" wp14:anchorId="67A23B3F" wp14:editId="55C7BD8C">
             <wp:extent cx="5334000" cy="4876800"/>
             <wp:effectExtent l="0" t="0" r="0" b="0"/>
             <wp:docPr id="8" name="30_editor" descr="Figura 7. Editor: datos del curso y de la lección." title="Figura 7. Editor: datos del curso y de la lección."/>
@@ -4464,7 +4586,7 @@
         </w:rPr>
         <w:lastRenderedPageBreak/>
         <w:drawing>
-          <wp:inline distT="0" distB="0" distL="0" distR="0" wp14:anchorId="48191B8F" wp14:editId="064320B8">
+          <wp:inline distT="0" distB="0" distL="0" distR="0" wp14:anchorId="6ABF7FA5" wp14:editId="4F90CA56">
             <wp:extent cx="5334000" cy="4876800"/>
             <wp:effectExtent l="0" t="0" r="0" b="0"/>
             <wp:docPr id="9" name="34_editor_preguntas" descr="Figura 8. Edición de preguntas y opciones." title="Figura 8. Edición de preguntas y opciones."/>
@@ -4576,7 +4698,7 @@
       <w:pPr>
         <w:pStyle w:val="Ttulo2"/>
       </w:pPr>
-      <w:bookmarkStart w:id="12" w:name="_Toc242803880"/>
+      <w:bookmarkStart w:id="12" w:name="_Toc242805110"/>
       <w:r>
         <w:t>3.4 Bancos de preguntas al azar</w:t>
       </w:r>
@@ -4628,7 +4750,7 @@
         </w:rPr>
         <w:lastRenderedPageBreak/>
         <w:drawing>
-          <wp:inline distT="0" distB="0" distL="0" distR="0" wp14:anchorId="584AF3E1" wp14:editId="4E7AF20D">
+          <wp:inline distT="0" distB="0" distL="0" distR="0" wp14:anchorId="00AF2694" wp14:editId="5A67AD5E">
             <wp:extent cx="5334000" cy="4876800"/>
             <wp:effectExtent l="0" t="0" r="0" b="0"/>
             <wp:docPr id="10" name="33_editor_banco" descr="Figura 9. Porcentaje de aprobación y preguntas por práctica." title="Figura 9. Porcentaje de aprobación y preguntas por práctica."/>
@@ -4773,9 +4895,9 @@
       <w:pPr>
         <w:pStyle w:val="Ttulo2"/>
       </w:pPr>
-      <w:bookmarkStart w:id="13" w:name="_Toc242803881"/>
-      <w:r>
-        <w:t>3.5 Avance de alumnos</w:t>
+      <w:bookmarkStart w:id="13" w:name="_Toc242805111"/>
+      <w:r>
+        <w:t>3.5 Banco de preguntas general</w:t>
       </w:r>
       <w:bookmarkEnd w:id="13"/>
     </w:p>
@@ -4784,75 +4906,17 @@
         <w:spacing w:after="120"/>
       </w:pPr>
       <w:r>
-        <w:t xml:space="preserve">En </w:t>
-      </w:r>
-      <w:r>
-        <w:rPr>
-          <w:b/>
-          <w:bCs/>
-        </w:rPr>
-        <w:t>Cursos → Avance de alumnos</w:t>
-      </w:r>
-      <w:r>
-        <w:t xml:space="preserve"> ves a cada alumno con su tienda, el curso, cuántas lecciones completó y su última actividad. Puedes filtrar por tienda y buscar por nombre o curso. Es la misma vista del Supervisor (capítulo 4).</w:t>
-      </w:r>
-    </w:p>
-    <w:p>
-      <w:pPr>
-        <w:pStyle w:val="Ttulo1"/>
-        <w:pageBreakBefore/>
-      </w:pPr>
-      <w:bookmarkStart w:id="14" w:name="_Toc242803882"/>
-      <w:r>
-        <w:lastRenderedPageBreak/>
-        <w:t>4. Supervisor</w:t>
-      </w:r>
-      <w:bookmarkEnd w:id="14"/>
-    </w:p>
-    <w:p>
-      <w:pPr>
-        <w:spacing w:after="120"/>
-      </w:pPr>
-      <w:r>
-        <w:t xml:space="preserve">El supervisor ve el módulo </w:t>
-      </w:r>
-      <w:r>
-        <w:rPr>
-          <w:b/>
-          <w:bCs/>
-        </w:rPr>
-        <w:t>Cursos</w:t>
-      </w:r>
-      <w:r>
-        <w:t xml:space="preserve"> en modo consulta: no puede crear ni editar cursos ni usuarios.</w:t>
-      </w:r>
-    </w:p>
-    <w:p>
-      <w:pPr>
-        <w:pStyle w:val="Ttulo2"/>
-      </w:pPr>
-      <w:bookmarkStart w:id="15" w:name="_Toc242803883"/>
-      <w:r>
-        <w:t>Catálogo</w:t>
-      </w:r>
-      <w:bookmarkEnd w:id="15"/>
-    </w:p>
-    <w:p>
-      <w:pPr>
-        <w:spacing w:after="120"/>
-      </w:pPr>
-      <w:r>
-        <w:t xml:space="preserve">En </w:t>
-      </w:r>
-      <w:r>
-        <w:rPr>
-          <w:b/>
-          <w:bCs/>
-        </w:rPr>
-        <w:t>Catálogo</w:t>
-      </w:r>
-      <w:r>
-        <w:t xml:space="preserve"> revisa los cursos, sus lecciones y sus preguntas con las respuestas correctas, para acompañar y resolver dudas de los alumnos.</w:t>
+        <w:t xml:space="preserve">En el menú </w:t>
+      </w:r>
+      <w:r>
+        <w:rPr>
+          <w:b/>
+          <w:bCs/>
+        </w:rPr>
+        <w:t>Banco de preguntas</w:t>
+      </w:r>
+      <w:r>
+        <w:t xml:space="preserve"> ves todas las preguntas de todos los cursos en un solo lugar, agrupadas por curso y lección, con la respuesta correcta marcada en verde.</w:t>
       </w:r>
     </w:p>
     <w:p>
@@ -4864,11 +4928,12 @@
         <w:rPr>
           <w:noProof/>
         </w:rPr>
+        <w:lastRenderedPageBreak/>
         <w:drawing>
-          <wp:inline distT="0" distB="0" distL="0" distR="0" wp14:anchorId="5DA4CB77" wp14:editId="161E7FE8">
-            <wp:extent cx="5715000" cy="3762375"/>
+          <wp:inline distT="0" distB="0" distL="0" distR="0" wp14:anchorId="5672D26E" wp14:editId="0DFF9EC1">
+            <wp:extent cx="5715000" cy="4181475"/>
             <wp:effectExtent l="0" t="0" r="0" b="0"/>
-            <wp:docPr id="11" name="50_supervisor_catalogo" descr="Figura 10. Catálogo en modo consulta." title="Figura 10. Catálogo en modo consulta."/>
+            <wp:docPr id="11" name="60_banco_admin" descr="Figura 10. Banco de preguntas general." title="Figura 10. Banco de preguntas general."/>
             <wp:cNvGraphicFramePr>
               <a:graphicFrameLocks xmlns:a="http://schemas.openxmlformats.org/drawingml/2006/main" noChangeAspect="1"/>
             </wp:cNvGraphicFramePr>
@@ -4891,7 +4956,7 @@
                   <pic:spPr bwMode="auto">
                     <a:xfrm>
                       <a:off x="0" y="0"/>
-                      <a:ext cx="5715000" cy="3762375"/>
+                      <a:ext cx="5715000" cy="4181475"/>
                     </a:xfrm>
                     <a:prstGeom prst="rect">
                       <a:avLst/>
@@ -4917,40 +4982,27 @@
           <w:sz w:val="18"/>
           <w:szCs w:val="18"/>
         </w:rPr>
-        <w:t>Figura 10. Catálogo en modo consulta.</w:t>
-      </w:r>
-    </w:p>
-    <w:p>
-      <w:pPr>
-        <w:pStyle w:val="Ttulo2"/>
-      </w:pPr>
-      <w:bookmarkStart w:id="16" w:name="_Toc242803884"/>
-      <w:r>
-        <w:t>Avance de alumnos</w:t>
-      </w:r>
-      <w:bookmarkEnd w:id="16"/>
+        <w:t>Figura 10. Banco de preguntas general.</w:t>
+      </w:r>
     </w:p>
     <w:p>
       <w:pPr>
         <w:pStyle w:val="Prrafodelista"/>
         <w:numPr>
           <w:ilvl w:val="0"/>
-          <w:numId w:val="6"/>
+          <w:numId w:val="2"/>
         </w:numPr>
         <w:spacing w:after="60"/>
       </w:pPr>
       <w:r>
-        <w:t xml:space="preserve">Toca </w:t>
-      </w:r>
-      <w:r>
-        <w:rPr>
-          <w:b/>
-          <w:bCs/>
-        </w:rPr>
-        <w:t>Avance de alumnos</w:t>
-      </w:r>
-      <w:r>
-        <w:t>.</w:t>
+        <w:rPr>
+          <w:b/>
+          <w:bCs/>
+        </w:rPr>
+        <w:t>Filtros</w:t>
+      </w:r>
+      <w:r>
+        <w:t>: tienda, curso, lección y tipo de respuesta (una correcta o varias).</w:t>
       </w:r>
     </w:p>
     <w:p>
@@ -4958,22 +5010,19 @@
         <w:pStyle w:val="Prrafodelista"/>
         <w:numPr>
           <w:ilvl w:val="0"/>
-          <w:numId w:val="6"/>
+          <w:numId w:val="2"/>
         </w:numPr>
         <w:spacing w:after="60"/>
       </w:pPr>
       <w:r>
-        <w:t xml:space="preserve">Usa los filtros </w:t>
-      </w:r>
-      <w:r>
-        <w:rPr>
-          <w:b/>
-          <w:bCs/>
-        </w:rPr>
-        <w:t>Todas / Ofertas / Mexi</w:t>
-      </w:r>
-      <w:r>
-        <w:t xml:space="preserve"> o el buscador para encontrar a una persona o un curso.</w:t>
+        <w:rPr>
+          <w:b/>
+          <w:bCs/>
+        </w:rPr>
+        <w:t>Buscador</w:t>
+      </w:r>
+      <w:r>
+        <w:t>: busca en el texto de las preguntas y de las opciones, sin importar acentos ni mayúsculas.</w:t>
       </w:r>
     </w:p>
     <w:p>
@@ -4981,32 +5030,142 @@
         <w:pStyle w:val="Prrafodelista"/>
         <w:numPr>
           <w:ilvl w:val="0"/>
-          <w:numId w:val="6"/>
+          <w:numId w:val="2"/>
         </w:numPr>
         <w:spacing w:after="60"/>
       </w:pPr>
       <w:r>
-        <w:t xml:space="preserve">Revisa la columna </w:t>
-      </w:r>
-      <w:r>
-        <w:rPr>
-          <w:b/>
-          <w:bCs/>
-        </w:rPr>
-        <w:t>Lecciones completadas</w:t>
-      </w:r>
-      <w:r>
-        <w:t xml:space="preserve"> (por ejemplo 1/3) y la </w:t>
-      </w:r>
-      <w:r>
-        <w:rPr>
-          <w:b/>
-          <w:bCs/>
-        </w:rPr>
-        <w:t>Última actividad</w:t>
-      </w:r>
-      <w:r>
-        <w:t>.</w:t>
+        <w:rPr>
+          <w:b/>
+          <w:bCs/>
+        </w:rPr>
+        <w:t>Editar</w:t>
+      </w:r>
+      <w:r>
+        <w:t>: corrige una pregunta sin abrir todo el curso. Se aplican las mismas reglas que en el editor.</w:t>
+      </w:r>
+    </w:p>
+    <w:p>
+      <w:pPr>
+        <w:pStyle w:val="Prrafodelista"/>
+        <w:numPr>
+          <w:ilvl w:val="0"/>
+          <w:numId w:val="2"/>
+        </w:numPr>
+        <w:spacing w:after="60"/>
+      </w:pPr>
+      <w:r>
+        <w:rPr>
+          <w:b/>
+          <w:bCs/>
+        </w:rPr>
+        <w:t>Ir al curso</w:t>
+      </w:r>
+      <w:r>
+        <w:t>: abre el curso al que pertenece la pregunta.</w:t>
+      </w:r>
+    </w:p>
+    <w:p>
+      <w:pPr>
+        <w:pBdr>
+          <w:left w:val="single" w:sz="24" w:space="8" w:color="C9A227"/>
+        </w:pBdr>
+        <w:shd w:val="clear" w:color="auto" w:fill="FBF6E6"/>
+        <w:spacing w:before="120" w:after="200"/>
+        <w:ind w:left="200" w:right="200"/>
+      </w:pPr>
+      <w:r>
+        <w:rPr>
+          <w:sz w:val="21"/>
+          <w:szCs w:val="21"/>
+        </w:rPr>
+        <w:t>Si cambias una opción que los alumnos ya respondieron, el sistema guarda la pregunta corregida como nueva y conserva la anterior en el historial de respuestas.</w:t>
+      </w:r>
+    </w:p>
+    <w:p>
+      <w:pPr>
+        <w:pStyle w:val="Ttulo2"/>
+      </w:pPr>
+      <w:bookmarkStart w:id="14" w:name="_Toc242805112"/>
+      <w:r>
+        <w:t>3.6 Avance de alumnos</w:t>
+      </w:r>
+      <w:bookmarkEnd w:id="14"/>
+    </w:p>
+    <w:p>
+      <w:pPr>
+        <w:spacing w:after="120"/>
+      </w:pPr>
+      <w:r>
+        <w:t xml:space="preserve">En </w:t>
+      </w:r>
+      <w:r>
+        <w:rPr>
+          <w:b/>
+          <w:bCs/>
+        </w:rPr>
+        <w:t>Cursos → Avance de alumnos</w:t>
+      </w:r>
+      <w:r>
+        <w:t xml:space="preserve"> ves a cada alumno con su tienda, el curso, cuántas lecciones completó y su última actividad. Puedes filtrar por tienda y buscar por nombre o curso. Es la misma vista del Supervisor (capítulo 4).</w:t>
+      </w:r>
+    </w:p>
+    <w:p>
+      <w:pPr>
+        <w:pStyle w:val="Ttulo1"/>
+        <w:pageBreakBefore/>
+      </w:pPr>
+      <w:bookmarkStart w:id="15" w:name="_Toc242805113"/>
+      <w:r>
+        <w:lastRenderedPageBreak/>
+        <w:t>4. Supervisor</w:t>
+      </w:r>
+      <w:bookmarkEnd w:id="15"/>
+    </w:p>
+    <w:p>
+      <w:pPr>
+        <w:spacing w:after="120"/>
+      </w:pPr>
+      <w:r>
+        <w:t xml:space="preserve">El supervisor ve el módulo </w:t>
+      </w:r>
+      <w:r>
+        <w:rPr>
+          <w:b/>
+          <w:bCs/>
+        </w:rPr>
+        <w:t>Cursos</w:t>
+      </w:r>
+      <w:r>
+        <w:t xml:space="preserve"> en modo consulta: no puede crear ni editar cursos ni usuarios.</w:t>
+      </w:r>
+    </w:p>
+    <w:p>
+      <w:pPr>
+        <w:pStyle w:val="Ttulo2"/>
+      </w:pPr>
+      <w:bookmarkStart w:id="16" w:name="_Toc242805114"/>
+      <w:r>
+        <w:t>Catálogo</w:t>
+      </w:r>
+      <w:bookmarkEnd w:id="16"/>
+    </w:p>
+    <w:p>
+      <w:pPr>
+        <w:spacing w:after="120"/>
+      </w:pPr>
+      <w:r>
+        <w:t xml:space="preserve">En </w:t>
+      </w:r>
+      <w:r>
+        <w:rPr>
+          <w:b/>
+          <w:bCs/>
+        </w:rPr>
+        <w:t>Catálogo</w:t>
+      </w:r>
+      <w:r>
+        <w:t xml:space="preserve"> revisa los cursos, sus lecciones y sus preguntas con las respuestas correctas, para acompañar y resolver dudas de los alumnos.</w:t>
       </w:r>
     </w:p>
     <w:p>
@@ -5018,12 +5177,11 @@
         <w:rPr>
           <w:noProof/>
         </w:rPr>
-        <w:lastRenderedPageBreak/>
         <w:drawing>
-          <wp:inline distT="0" distB="0" distL="0" distR="0" wp14:anchorId="2B1D9B6F" wp14:editId="29E0B4FC">
+          <wp:inline distT="0" distB="0" distL="0" distR="0" wp14:anchorId="227A0EF5" wp14:editId="3F9C935D">
             <wp:extent cx="5715000" cy="3762375"/>
             <wp:effectExtent l="0" t="0" r="0" b="0"/>
-            <wp:docPr id="12" name="51_supervisor_avance" descr="Figura 11. Avance de los alumnos." title="Figura 11. Avance de los alumnos."/>
+            <wp:docPr id="12" name="50_supervisor_catalogo" descr="Figura 11. Catálogo en modo consulta." title="Figura 11. Catálogo en modo consulta."/>
             <wp:cNvGraphicFramePr>
               <a:graphicFrameLocks xmlns:a="http://schemas.openxmlformats.org/drawingml/2006/main" noChangeAspect="1"/>
             </wp:cNvGraphicFramePr>
@@ -5072,160 +5230,124 @@
           <w:sz w:val="18"/>
           <w:szCs w:val="18"/>
         </w:rPr>
-        <w:t>Figura 11. Avance de los alumnos.</w:t>
-      </w:r>
+        <w:t>Figura 11. Catálogo en modo consulta.</w:t>
+      </w:r>
+    </w:p>
+    <w:p>
+      <w:pPr>
+        <w:pStyle w:val="Ttulo2"/>
+      </w:pPr>
+      <w:bookmarkStart w:id="17" w:name="_Toc242805115"/>
+      <w:r>
+        <w:t>Banco de preguntas</w:t>
+      </w:r>
+      <w:bookmarkEnd w:id="17"/>
     </w:p>
     <w:p>
       <w:pPr>
         <w:spacing w:after="120"/>
       </w:pPr>
       <w:r>
-        <w:t xml:space="preserve">Una lección cuenta como completada cuando el alumno marcó la teoría como leída </w:t>
-      </w:r>
-      <w:r>
-        <w:rPr>
-          <w:b/>
-          <w:bCs/>
-        </w:rPr>
-        <w:t>y</w:t>
-      </w:r>
-      <w:r>
-        <w:t xml:space="preserve"> aprobó la práctica. </w:t>
-      </w:r>
-      <w:r>
-        <w:rPr>
-          <w:b/>
-          <w:bCs/>
-        </w:rPr>
-        <w:t>Sin actividad</w:t>
-      </w:r>
-      <w:r>
-        <w:t xml:space="preserve"> quiere decir que todavía no empezó.</w:t>
-      </w:r>
-    </w:p>
-    <w:p>
-      <w:pPr>
-        <w:pBdr>
-          <w:left w:val="single" w:sz="24" w:space="8" w:color="C9A227"/>
-        </w:pBdr>
-        <w:shd w:val="clear" w:color="auto" w:fill="FBF6E6"/>
-        <w:spacing w:before="120" w:after="200"/>
-        <w:ind w:left="200" w:right="200"/>
-      </w:pPr>
-      <w:r>
-        <w:rPr>
-          <w:sz w:val="21"/>
-          <w:szCs w:val="21"/>
-        </w:rPr>
-        <w:t>Usa esta vista para dar seguimiento: quién no ha empezado, quién lleva días sin avanzar y quién ya terminó.</w:t>
-      </w:r>
-    </w:p>
-    <w:p>
-      <w:pPr>
-        <w:pStyle w:val="Ttulo1"/>
-        <w:pageBreakBefore/>
-      </w:pPr>
-      <w:bookmarkStart w:id="17" w:name="_Toc242803885"/>
-      <w:r>
-        <w:lastRenderedPageBreak/>
-        <w:t>5. Consulta gerencial</w:t>
-      </w:r>
-      <w:bookmarkEnd w:id="17"/>
-    </w:p>
-    <w:p>
-      <w:pPr>
-        <w:spacing w:after="120"/>
-      </w:pPr>
-      <w:r>
-        <w:t xml:space="preserve">La consulta gerencial tiene acceso de </w:t>
-      </w:r>
-      <w:r>
-        <w:rPr>
-          <w:b/>
-          <w:bCs/>
-        </w:rPr>
-        <w:t>solo lectura</w:t>
-      </w:r>
-      <w:r>
-        <w:t xml:space="preserve"> a </w:t>
-      </w:r>
-      <w:r>
-        <w:rPr>
-          <w:b/>
-          <w:bCs/>
-        </w:rPr>
-        <w:t>Cursos</w:t>
-      </w:r>
-      <w:r>
-        <w:t xml:space="preserve">: el </w:t>
-      </w:r>
-      <w:r>
-        <w:rPr>
-          <w:b/>
-          <w:bCs/>
-        </w:rPr>
-        <w:t>Catálogo</w:t>
-      </w:r>
-      <w:r>
-        <w:t xml:space="preserve"> y el </w:t>
-      </w:r>
-      <w:r>
-        <w:rPr>
-          <w:b/>
-          <w:bCs/>
-        </w:rPr>
+        <w:t xml:space="preserve">En el menú </w:t>
+      </w:r>
+      <w:r>
+        <w:rPr>
+          <w:b/>
+          <w:bCs/>
+        </w:rPr>
+        <w:t>Banco de preguntas</w:t>
+      </w:r>
+      <w:r>
+        <w:t xml:space="preserve"> el supervisor consulta todas las preguntas de todos los cursos, con filtros y buscador, y ve cuál es la respuesta correcta. No puede editarlas (ver el apartado 3.5).</w:t>
+      </w:r>
+    </w:p>
+    <w:p>
+      <w:pPr>
+        <w:pStyle w:val="Ttulo2"/>
+      </w:pPr>
+      <w:bookmarkStart w:id="18" w:name="_Toc242805116"/>
+      <w:r>
         <w:t>Avance de alumnos</w:t>
       </w:r>
-      <w:r>
-        <w:t>, igual que el Supervisor (capítulo 4). No puede modificar nada.</w:t>
-      </w:r>
-    </w:p>
-    <w:p>
-      <w:pPr>
-        <w:spacing w:after="120"/>
-      </w:pPr>
-      <w:r>
-        <w:t>Uso sugerido: revisar el avance general por tienda con los filtros de la vista de avance y pedir al supervisor o al administrador los ajustes que hagan falta.</w:t>
-      </w:r>
-    </w:p>
-    <w:p>
-      <w:pPr>
-        <w:pStyle w:val="Ttulo1"/>
-        <w:pageBreakBefore/>
-      </w:pPr>
-      <w:bookmarkStart w:id="18" w:name="_Toc242803886"/>
-      <w:r>
-        <w:lastRenderedPageBreak/>
-        <w:t>6. Auditor</w:t>
-      </w:r>
       <w:bookmarkEnd w:id="18"/>
     </w:p>
     <w:p>
       <w:pPr>
-        <w:spacing w:after="120"/>
-      </w:pPr>
-      <w:r>
-        <w:t xml:space="preserve">El módulo de </w:t>
-      </w:r>
-      <w:r>
-        <w:rPr>
-          <w:b/>
-          <w:bCs/>
-        </w:rPr>
-        <w:t>Auditorías</w:t>
-      </w:r>
-      <w:r>
-        <w:t xml:space="preserve"> todavía no está habilitado en esta versión. Al entrar, el auditor ve el aviso </w:t>
-      </w:r>
-      <w:r>
-        <w:rPr>
-          <w:b/>
-          <w:bCs/>
-        </w:rPr>
-        <w:t>Sin módulos disponibles</w:t>
-      </w:r>
-      <w:r>
-        <w:t>. Puede cambiar su contraseña y cerrar sesión desde su panel de usuario.</w:t>
+        <w:pStyle w:val="Prrafodelista"/>
+        <w:numPr>
+          <w:ilvl w:val="0"/>
+          <w:numId w:val="6"/>
+        </w:numPr>
+        <w:spacing w:after="60"/>
+      </w:pPr>
+      <w:r>
+        <w:t xml:space="preserve">Toca </w:t>
+      </w:r>
+      <w:r>
+        <w:rPr>
+          <w:b/>
+          <w:bCs/>
+        </w:rPr>
+        <w:t>Avance de alumnos</w:t>
+      </w:r>
+      <w:r>
+        <w:t>.</w:t>
+      </w:r>
+    </w:p>
+    <w:p>
+      <w:pPr>
+        <w:pStyle w:val="Prrafodelista"/>
+        <w:numPr>
+          <w:ilvl w:val="0"/>
+          <w:numId w:val="6"/>
+        </w:numPr>
+        <w:spacing w:after="60"/>
+      </w:pPr>
+      <w:r>
+        <w:t xml:space="preserve">Usa los filtros </w:t>
+      </w:r>
+      <w:r>
+        <w:rPr>
+          <w:b/>
+          <w:bCs/>
+        </w:rPr>
+        <w:t>Todas / Ofertas / Mexi</w:t>
+      </w:r>
+      <w:r>
+        <w:t xml:space="preserve"> o el buscador para encontrar a una persona o un curso.</w:t>
+      </w:r>
+    </w:p>
+    <w:p>
+      <w:pPr>
+        <w:pStyle w:val="Prrafodelista"/>
+        <w:numPr>
+          <w:ilvl w:val="0"/>
+          <w:numId w:val="6"/>
+        </w:numPr>
+        <w:spacing w:after="60"/>
+      </w:pPr>
+      <w:r>
+        <w:t xml:space="preserve">Revisa la columna </w:t>
+      </w:r>
+      <w:r>
+        <w:rPr>
+          <w:b/>
+          <w:bCs/>
+        </w:rPr>
+        <w:t>Lecciones completadas</w:t>
+      </w:r>
+      <w:r>
+        <w:t xml:space="preserve"> (por ejemplo 1/3) y la </w:t>
+      </w:r>
+      <w:r>
+        <w:rPr>
+          <w:b/>
+          <w:bCs/>
+        </w:rPr>
+        <w:t>Última actividad</w:t>
+      </w:r>
+      <w:r>
+        <w:t>.</w:t>
       </w:r>
     </w:p>
     <w:p>
@@ -5237,11 +5359,12 @@
         <w:rPr>
           <w:noProof/>
         </w:rPr>
+        <w:lastRenderedPageBreak/>
         <w:drawing>
-          <wp:inline distT="0" distB="0" distL="0" distR="0" wp14:anchorId="2C8C0236" wp14:editId="123DA338">
-            <wp:extent cx="5334000" cy="3200400"/>
+          <wp:inline distT="0" distB="0" distL="0" distR="0" wp14:anchorId="74CE1FC3" wp14:editId="22A578E6">
+            <wp:extent cx="5715000" cy="3762375"/>
             <wp:effectExtent l="0" t="0" r="0" b="0"/>
-            <wp:docPr id="13" name="01_inicio_auditor1" descr="Figura 12. Vista del auditor en la versión 1.0.0." title="Figura 12. Vista del auditor en la versión 1.0.0."/>
+            <wp:docPr id="13" name="51_supervisor_avance" descr="Figura 12. Avance de los alumnos." title="Figura 12. Avance de los alumnos."/>
             <wp:cNvGraphicFramePr>
               <a:graphicFrameLocks xmlns:a="http://schemas.openxmlformats.org/drawingml/2006/main" noChangeAspect="1"/>
             </wp:cNvGraphicFramePr>
@@ -5264,7 +5387,7 @@
                   <pic:spPr bwMode="auto">
                     <a:xfrm>
                       <a:off x="0" y="0"/>
-                      <a:ext cx="5334000" cy="3200400"/>
+                      <a:ext cx="5715000" cy="3762375"/>
                     </a:xfrm>
                     <a:prstGeom prst="rect">
                       <a:avLst/>
@@ -5290,7 +5413,7 @@
           <w:sz w:val="18"/>
           <w:szCs w:val="18"/>
         </w:rPr>
-        <w:t>Figura 12. Vista del auditor en la versión 1.0.0.</w:t>
+        <w:t>Figura 12. Avance de los alumnos.</w:t>
       </w:r>
     </w:p>
     <w:p>
@@ -5298,7 +5421,44 @@
         <w:spacing w:after="120"/>
       </w:pPr>
       <w:r>
-        <w:t>Cuando se habilite el módulo, este capítulo se actualizará con el registro de auditorías e irregularidades.</w:t>
+        <w:t xml:space="preserve">Una lección cuenta como completada cuando el alumno marcó la teoría como leída </w:t>
+      </w:r>
+      <w:r>
+        <w:rPr>
+          <w:b/>
+          <w:bCs/>
+        </w:rPr>
+        <w:t>y</w:t>
+      </w:r>
+      <w:r>
+        <w:t xml:space="preserve"> aprobó la práctica. </w:t>
+      </w:r>
+      <w:r>
+        <w:rPr>
+          <w:b/>
+          <w:bCs/>
+        </w:rPr>
+        <w:t>Sin actividad</w:t>
+      </w:r>
+      <w:r>
+        <w:t xml:space="preserve"> quiere decir que todavía no empezó.</w:t>
+      </w:r>
+    </w:p>
+    <w:p>
+      <w:pPr>
+        <w:pBdr>
+          <w:left w:val="single" w:sz="24" w:space="8" w:color="C9A227"/>
+        </w:pBdr>
+        <w:shd w:val="clear" w:color="auto" w:fill="FBF6E6"/>
+        <w:spacing w:before="120" w:after="200"/>
+        <w:ind w:left="200" w:right="200"/>
+      </w:pPr>
+      <w:r>
+        <w:rPr>
+          <w:sz w:val="21"/>
+          <w:szCs w:val="21"/>
+        </w:rPr>
+        <w:t>Usa esta vista para dar seguimiento: quién no ha empezado, quién lleva días sin avanzar y quién ya terminó.</w:t>
       </w:r>
     </w:p>
     <w:p>
@@ -5306,10 +5466,10 @@
         <w:pStyle w:val="Ttulo1"/>
         <w:pageBreakBefore/>
       </w:pPr>
-      <w:bookmarkStart w:id="19" w:name="_Toc242803887"/>
+      <w:bookmarkStart w:id="19" w:name="_Toc242805117"/>
       <w:r>
         <w:lastRenderedPageBreak/>
-        <w:t>7. Alumno / Cobrador</w:t>
+        <w:t>5. Consulta gerencial</w:t>
       </w:r>
       <w:bookmarkEnd w:id="19"/>
     </w:p>
@@ -5318,26 +5478,76 @@
         <w:spacing w:after="120"/>
       </w:pPr>
       <w:r>
-        <w:t xml:space="preserve">Como alumno ves </w:t>
-      </w:r>
-      <w:r>
-        <w:rPr>
-          <w:b/>
-          <w:bCs/>
-        </w:rPr>
-        <w:t>Mis cursos</w:t>
-      </w:r>
-      <w:r>
-        <w:t>: solo los cursos asignados a tu tienda.</w:t>
-      </w:r>
-    </w:p>
-    <w:p>
-      <w:pPr>
-        <w:pStyle w:val="Ttulo2"/>
-      </w:pPr>
-      <w:bookmarkStart w:id="20" w:name="_Toc242803888"/>
-      <w:r>
-        <w:t>7.1 Mis cursos y tu camino de avance</w:t>
+        <w:t xml:space="preserve">La consulta gerencial tiene acceso de </w:t>
+      </w:r>
+      <w:r>
+        <w:rPr>
+          <w:b/>
+          <w:bCs/>
+        </w:rPr>
+        <w:t>solo lectura</w:t>
+      </w:r>
+      <w:r>
+        <w:t xml:space="preserve"> a </w:t>
+      </w:r>
+      <w:r>
+        <w:rPr>
+          <w:b/>
+          <w:bCs/>
+        </w:rPr>
+        <w:t>Cursos</w:t>
+      </w:r>
+      <w:r>
+        <w:t xml:space="preserve">: el </w:t>
+      </w:r>
+      <w:r>
+        <w:rPr>
+          <w:b/>
+          <w:bCs/>
+        </w:rPr>
+        <w:t>Catálogo</w:t>
+      </w:r>
+      <w:r>
+        <w:t xml:space="preserve">, el </w:t>
+      </w:r>
+      <w:r>
+        <w:rPr>
+          <w:b/>
+          <w:bCs/>
+        </w:rPr>
+        <w:t>Banco de preguntas</w:t>
+      </w:r>
+      <w:r>
+        <w:t xml:space="preserve"> y el </w:t>
+      </w:r>
+      <w:r>
+        <w:rPr>
+          <w:b/>
+          <w:bCs/>
+        </w:rPr>
+        <w:t>Avance de alumnos</w:t>
+      </w:r>
+      <w:r>
+        <w:t>, igual que el Supervisor (capítulo 4). No puede modificar nada.</w:t>
+      </w:r>
+    </w:p>
+    <w:p>
+      <w:pPr>
+        <w:spacing w:after="120"/>
+      </w:pPr>
+      <w:r>
+        <w:t>Uso sugerido: revisar el avance general por tienda con los filtros de la vista de avance y pedir al supervisor o al administrador los ajustes que hagan falta.</w:t>
+      </w:r>
+    </w:p>
+    <w:p>
+      <w:pPr>
+        <w:pStyle w:val="Ttulo1"/>
+        <w:pageBreakBefore/>
+      </w:pPr>
+      <w:bookmarkStart w:id="20" w:name="_Toc242805118"/>
+      <w:r>
+        <w:lastRenderedPageBreak/>
+        <w:t>6. Auditor</w:t>
       </w:r>
       <w:bookmarkEnd w:id="20"/>
     </w:p>
@@ -5346,105 +5556,27 @@
         <w:spacing w:after="120"/>
       </w:pPr>
       <w:r>
-        <w:t xml:space="preserve">Arriba siempre ves la barra con el porcentaje de avance del curso elegido. Más abajo, el </w:t>
-      </w:r>
-      <w:r>
-        <w:rPr>
-          <w:b/>
-          <w:bCs/>
-        </w:rPr>
-        <w:t>Camino de avance</w:t>
-      </w:r>
-      <w:r>
-        <w:t xml:space="preserve"> muestra cada lección con su estado:</w:t>
-      </w:r>
-    </w:p>
-    <w:p>
-      <w:pPr>
-        <w:pStyle w:val="Prrafodelista"/>
-        <w:numPr>
-          <w:ilvl w:val="0"/>
-          <w:numId w:val="2"/>
-        </w:numPr>
-        <w:spacing w:after="60"/>
-      </w:pPr>
-      <w:r>
-        <w:rPr>
-          <w:b/>
-          <w:bCs/>
-        </w:rPr>
-        <w:t>Completa</w:t>
-      </w:r>
-      <w:r>
-        <w:t xml:space="preserve"> (verde): teoría leída y práctica aprobada. Muestra tu mejor nota.</w:t>
-      </w:r>
-    </w:p>
-    <w:p>
-      <w:pPr>
-        <w:pStyle w:val="Prrafodelista"/>
-        <w:numPr>
-          <w:ilvl w:val="0"/>
-          <w:numId w:val="2"/>
-        </w:numPr>
-        <w:spacing w:after="60"/>
-      </w:pPr>
-      <w:r>
-        <w:rPr>
-          <w:b/>
-          <w:bCs/>
-        </w:rPr>
-        <w:t>Falta teoría</w:t>
-      </w:r>
-      <w:r>
-        <w:t xml:space="preserve"> o </w:t>
-      </w:r>
-      <w:r>
-        <w:rPr>
-          <w:b/>
-          <w:bCs/>
-        </w:rPr>
-        <w:t>Falta práctica</w:t>
-      </w:r>
-      <w:r>
-        <w:t xml:space="preserve"> (azul): es la lección en la que vas.</w:t>
-      </w:r>
-    </w:p>
-    <w:p>
-      <w:pPr>
-        <w:pStyle w:val="Prrafodelista"/>
-        <w:numPr>
-          <w:ilvl w:val="0"/>
-          <w:numId w:val="2"/>
-        </w:numPr>
-        <w:spacing w:after="60"/>
-      </w:pPr>
-      <w:r>
-        <w:rPr>
-          <w:b/>
-          <w:bCs/>
-        </w:rPr>
-        <w:t>Bloqueada</w:t>
-      </w:r>
-      <w:r>
-        <w:t xml:space="preserve"> (candado): se abre cuando completes la anterior.</w:t>
-      </w:r>
-    </w:p>
-    <w:p>
-      <w:pPr>
-        <w:spacing w:after="120"/>
-      </w:pPr>
-      <w:r>
-        <w:t xml:space="preserve">El recuadro </w:t>
-      </w:r>
-      <w:r>
-        <w:rPr>
-          <w:b/>
-          <w:bCs/>
-        </w:rPr>
-        <w:t>Siguiente</w:t>
-      </w:r>
-      <w:r>
-        <w:t xml:space="preserve"> te dice qué te toca hacer.</w:t>
+        <w:t xml:space="preserve">El módulo de </w:t>
+      </w:r>
+      <w:r>
+        <w:rPr>
+          <w:b/>
+          <w:bCs/>
+        </w:rPr>
+        <w:t>Auditorías</w:t>
+      </w:r>
+      <w:r>
+        <w:t xml:space="preserve"> todavía no está habilitado en esta versión. Al entrar, el auditor ve el aviso </w:t>
+      </w:r>
+      <w:r>
+        <w:rPr>
+          <w:b/>
+          <w:bCs/>
+        </w:rPr>
+        <w:t>Sin módulos disponibles</w:t>
+      </w:r>
+      <w:r>
+        <w:t>. Puede cambiar su contraseña y cerrar sesión desde su panel de usuario.</w:t>
       </w:r>
     </w:p>
     <w:p>
@@ -5457,10 +5589,10 @@
           <w:noProof/>
         </w:rPr>
         <w:drawing>
-          <wp:inline distT="0" distB="0" distL="0" distR="0" wp14:anchorId="61AB4766" wp14:editId="02DF0CC5">
-            <wp:extent cx="5715000" cy="5086350"/>
+          <wp:inline distT="0" distB="0" distL="0" distR="0" wp14:anchorId="411BC92D" wp14:editId="620190F9">
+            <wp:extent cx="5334000" cy="3200400"/>
             <wp:effectExtent l="0" t="0" r="0" b="0"/>
-            <wp:docPr id="14" name="20_alumno_largo" descr="Figura 13. Mis cursos y camino de avance." title="Figura 13. Mis cursos y camino de avance."/>
+            <wp:docPr id="14" name="01_inicio_auditor1" descr="Figura 13. Vista del auditor en la versión 1.0.0." title="Figura 13. Vista del auditor en la versión 1.0.0."/>
             <wp:cNvGraphicFramePr>
               <a:graphicFrameLocks xmlns:a="http://schemas.openxmlformats.org/drawingml/2006/main" noChangeAspect="1"/>
             </wp:cNvGraphicFramePr>
@@ -5483,7 +5615,7 @@
                   <pic:spPr bwMode="auto">
                     <a:xfrm>
                       <a:off x="0" y="0"/>
-                      <a:ext cx="5715000" cy="5086350"/>
+                      <a:ext cx="5334000" cy="3200400"/>
                     </a:xfrm>
                     <a:prstGeom prst="rect">
                       <a:avLst/>
@@ -5509,40 +5641,93 @@
           <w:sz w:val="18"/>
           <w:szCs w:val="18"/>
         </w:rPr>
-        <w:t>Figura 13. Mis cursos y camino de avance.</w:t>
+        <w:t>Figura 13. Vista del auditor en la versión 1.0.0.</w:t>
+      </w:r>
+    </w:p>
+    <w:p>
+      <w:pPr>
+        <w:spacing w:after="120"/>
+      </w:pPr>
+      <w:r>
+        <w:t>Cuando se habilite el módulo, este capítulo se actualizará con el registro de auditorías e irregularidades.</w:t>
+      </w:r>
+    </w:p>
+    <w:p>
+      <w:pPr>
+        <w:pStyle w:val="Ttulo1"/>
+        <w:pageBreakBefore/>
+      </w:pPr>
+      <w:bookmarkStart w:id="21" w:name="_Toc242805119"/>
+      <w:r>
+        <w:lastRenderedPageBreak/>
+        <w:t>7. Alumno / Cobrador</w:t>
+      </w:r>
+      <w:bookmarkEnd w:id="21"/>
+    </w:p>
+    <w:p>
+      <w:pPr>
+        <w:spacing w:after="120"/>
+      </w:pPr>
+      <w:r>
+        <w:t xml:space="preserve">Como alumno ves </w:t>
+      </w:r>
+      <w:r>
+        <w:rPr>
+          <w:b/>
+          <w:bCs/>
+        </w:rPr>
+        <w:t>Mis cursos</w:t>
+      </w:r>
+      <w:r>
+        <w:t>: solo los cursos asignados a tu tienda.</w:t>
       </w:r>
     </w:p>
     <w:p>
       <w:pPr>
         <w:pStyle w:val="Ttulo2"/>
       </w:pPr>
-      <w:bookmarkStart w:id="21" w:name="_Toc242803889"/>
-      <w:r>
-        <w:t>7.2 Leer la teoría</w:t>
-      </w:r>
-      <w:bookmarkEnd w:id="21"/>
+      <w:bookmarkStart w:id="22" w:name="_Toc242805120"/>
+      <w:r>
+        <w:t>7.1 Mis cursos y tu camino de avance</w:t>
+      </w:r>
+      <w:bookmarkEnd w:id="22"/>
+    </w:p>
+    <w:p>
+      <w:pPr>
+        <w:spacing w:after="120"/>
+      </w:pPr>
+      <w:r>
+        <w:t xml:space="preserve">Arriba siempre ves la barra con el porcentaje de avance del curso elegido. Más abajo, el </w:t>
+      </w:r>
+      <w:r>
+        <w:rPr>
+          <w:b/>
+          <w:bCs/>
+        </w:rPr>
+        <w:t>Camino de avance</w:t>
+      </w:r>
+      <w:r>
+        <w:t xml:space="preserve"> muestra cada lección con su estado:</w:t>
+      </w:r>
     </w:p>
     <w:p>
       <w:pPr>
         <w:pStyle w:val="Prrafodelista"/>
         <w:numPr>
           <w:ilvl w:val="0"/>
-          <w:numId w:val="7"/>
+          <w:numId w:val="2"/>
         </w:numPr>
         <w:spacing w:after="60"/>
       </w:pPr>
       <w:r>
-        <w:t xml:space="preserve">Toca </w:t>
-      </w:r>
-      <w:r>
-        <w:rPr>
-          <w:b/>
-          <w:bCs/>
-        </w:rPr>
-        <w:t>Ver lección</w:t>
-      </w:r>
-      <w:r>
-        <w:t xml:space="preserve"> (o el ícono de la tarjeta de la lección).</w:t>
+        <w:rPr>
+          <w:b/>
+          <w:bCs/>
+        </w:rPr>
+        <w:t>Completa</w:t>
+      </w:r>
+      <w:r>
+        <w:t xml:space="preserve"> (verde): teoría leída y práctica aprobada. Muestra tu mejor nota.</w:t>
       </w:r>
     </w:p>
     <w:p>
@@ -5550,12 +5735,29 @@
         <w:pStyle w:val="Prrafodelista"/>
         <w:numPr>
           <w:ilvl w:val="0"/>
-          <w:numId w:val="7"/>
+          <w:numId w:val="2"/>
         </w:numPr>
         <w:spacing w:after="60"/>
       </w:pPr>
       <w:r>
-        <w:t>Lee el objetivo, el contenido y la regla de avance. La teoría no tiene límite de tiempo.</w:t>
+        <w:rPr>
+          <w:b/>
+          <w:bCs/>
+        </w:rPr>
+        <w:t>Falta teoría</w:t>
+      </w:r>
+      <w:r>
+        <w:t xml:space="preserve"> o </w:t>
+      </w:r>
+      <w:r>
+        <w:rPr>
+          <w:b/>
+          <w:bCs/>
+        </w:rPr>
+        <w:t>Falta práctica</w:t>
+      </w:r>
+      <w:r>
+        <w:t xml:space="preserve"> (azul): es la lección en la que vas.</w:t>
       </w:r>
     </w:p>
     <w:p>
@@ -5563,22 +5765,37 @@
         <w:pStyle w:val="Prrafodelista"/>
         <w:numPr>
           <w:ilvl w:val="0"/>
-          <w:numId w:val="7"/>
+          <w:numId w:val="2"/>
         </w:numPr>
         <w:spacing w:after="60"/>
       </w:pPr>
       <w:r>
-        <w:t xml:space="preserve">Al terminar, toca </w:t>
-      </w:r>
-      <w:r>
-        <w:rPr>
-          <w:b/>
-          <w:bCs/>
-        </w:rPr>
-        <w:t>Marcar teoría como leída</w:t>
-      </w:r>
-      <w:r>
-        <w:t>. Con eso se habilita la práctica.</w:t>
+        <w:rPr>
+          <w:b/>
+          <w:bCs/>
+        </w:rPr>
+        <w:t>Bloqueada</w:t>
+      </w:r>
+      <w:r>
+        <w:t xml:space="preserve"> (candado): se abre cuando completes la anterior.</w:t>
+      </w:r>
+    </w:p>
+    <w:p>
+      <w:pPr>
+        <w:spacing w:after="120"/>
+      </w:pPr>
+      <w:r>
+        <w:t xml:space="preserve">El recuadro </w:t>
+      </w:r>
+      <w:r>
+        <w:rPr>
+          <w:b/>
+          <w:bCs/>
+        </w:rPr>
+        <w:t>Siguiente</w:t>
+      </w:r>
+      <w:r>
+        <w:t xml:space="preserve"> te dice qué te toca hacer.</w:t>
       </w:r>
     </w:p>
     <w:p>
@@ -5590,12 +5807,11 @@
         <w:rPr>
           <w:noProof/>
         </w:rPr>
-        <w:lastRenderedPageBreak/>
         <w:drawing>
-          <wp:inline distT="0" distB="0" distL="0" distR="0" wp14:anchorId="41F98695" wp14:editId="1CACD1A2">
-            <wp:extent cx="5334000" cy="4876800"/>
+          <wp:inline distT="0" distB="0" distL="0" distR="0" wp14:anchorId="71238130" wp14:editId="7A1FFB61">
+            <wp:extent cx="5715000" cy="5086350"/>
             <wp:effectExtent l="0" t="0" r="0" b="0"/>
-            <wp:docPr id="15" name="40_teoria" descr="Figura 14. Teoría de una lección." title="Figura 14. Teoría de una lección."/>
+            <wp:docPr id="15" name="20_alumno_largo" descr="Figura 14. Mis cursos y camino de avance." title="Figura 14. Mis cursos y camino de avance."/>
             <wp:cNvGraphicFramePr>
               <a:graphicFrameLocks xmlns:a="http://schemas.openxmlformats.org/drawingml/2006/main" noChangeAspect="1"/>
             </wp:cNvGraphicFramePr>
@@ -5618,7 +5834,7 @@
                   <pic:spPr bwMode="auto">
                     <a:xfrm>
                       <a:off x="0" y="0"/>
-                      <a:ext cx="5334000" cy="4876800"/>
+                      <a:ext cx="5715000" cy="5086350"/>
                     </a:xfrm>
                     <a:prstGeom prst="rect">
                       <a:avLst/>
@@ -5644,40 +5860,25 @@
           <w:sz w:val="18"/>
           <w:szCs w:val="18"/>
         </w:rPr>
-        <w:t>Figura 14. Teoría de una lección.</w:t>
+        <w:t>Figura 14. Mis cursos y camino de avance.</w:t>
       </w:r>
     </w:p>
     <w:p>
       <w:pPr>
         <w:pStyle w:val="Ttulo2"/>
       </w:pPr>
-      <w:bookmarkStart w:id="22" w:name="_Toc242803890"/>
-      <w:r>
-        <w:t>7.3 Hacer la práctica</w:t>
-      </w:r>
-      <w:bookmarkEnd w:id="22"/>
-    </w:p>
-    <w:p>
-      <w:pPr>
-        <w:spacing w:after="120"/>
-      </w:pPr>
-      <w:r>
-        <w:t xml:space="preserve">Cada lección indica cómo es su práctica, por ejemplo: </w:t>
-      </w:r>
-      <w:r>
-        <w:rPr>
-          <w:b/>
-          <w:bCs/>
-        </w:rPr>
-        <w:t>Práctica: 4 preguntas al azar de un banco de 6 · aprueba con 75%.</w:t>
-      </w:r>
+      <w:bookmarkStart w:id="23" w:name="_Toc242805121"/>
+      <w:r>
+        <w:t>7.2 Leer la teoría</w:t>
+      </w:r>
+      <w:bookmarkEnd w:id="23"/>
     </w:p>
     <w:p>
       <w:pPr>
         <w:pStyle w:val="Prrafodelista"/>
         <w:numPr>
           <w:ilvl w:val="0"/>
-          <w:numId w:val="8"/>
+          <w:numId w:val="7"/>
         </w:numPr>
         <w:spacing w:after="60"/>
       </w:pPr>
@@ -5689,10 +5890,10 @@
           <w:b/>
           <w:bCs/>
         </w:rPr>
-        <w:t>Iniciar práctica</w:t>
-      </w:r>
-      <w:r>
-        <w:t>.</w:t>
+        <w:t>Ver lección</w:t>
+      </w:r>
+      <w:r>
+        <w:t xml:space="preserve"> (o el ícono de la tarjeta de la lección).</w:t>
       </w:r>
     </w:p>
     <w:p>
@@ -5700,32 +5901,12 @@
         <w:pStyle w:val="Prrafodelista"/>
         <w:numPr>
           <w:ilvl w:val="0"/>
-          <w:numId w:val="8"/>
+          <w:numId w:val="7"/>
         </w:numPr>
         <w:spacing w:after="60"/>
       </w:pPr>
       <w:r>
-        <w:t xml:space="preserve">Responde </w:t>
-      </w:r>
-      <w:r>
-        <w:rPr>
-          <w:b/>
-          <w:bCs/>
-        </w:rPr>
-        <w:t>una pregunta a la vez</w:t>
-      </w:r>
-      <w:r>
-        <w:t xml:space="preserve">. Tienes un tiempo por pregunta que ves en la barra. En las preguntas de varias respuestas, marca </w:t>
-      </w:r>
-      <w:r>
-        <w:rPr>
-          <w:b/>
-          <w:bCs/>
-        </w:rPr>
-        <w:t>todas</w:t>
-      </w:r>
-      <w:r>
-        <w:t xml:space="preserve"> las correctas.</w:t>
+        <w:t>Lee el objetivo, el contenido y la regla de avance. La teoría no tiene límite de tiempo.</w:t>
       </w:r>
     </w:p>
     <w:p>
@@ -5733,68 +5914,22 @@
         <w:pStyle w:val="Prrafodelista"/>
         <w:numPr>
           <w:ilvl w:val="0"/>
-          <w:numId w:val="8"/>
+          <w:numId w:val="7"/>
         </w:numPr>
         <w:spacing w:after="60"/>
       </w:pPr>
       <w:r>
-        <w:t xml:space="preserve">Toca </w:t>
-      </w:r>
-      <w:r>
-        <w:rPr>
-          <w:b/>
-          <w:bCs/>
-        </w:rPr>
-        <w:t>Siguiente pregunta</w:t>
-      </w:r>
-      <w:r>
-        <w:t>. No puedes avanzar sin elegir una respuesta.</w:t>
-      </w:r>
-    </w:p>
-    <w:p>
-      <w:pPr>
-        <w:pStyle w:val="Prrafodelista"/>
-        <w:numPr>
-          <w:ilvl w:val="0"/>
-          <w:numId w:val="8"/>
-        </w:numPr>
-        <w:spacing w:after="60"/>
-      </w:pPr>
-      <w:r>
-        <w:t>Al terminar se envían tus respuestas y el sistema calcula la nota.</w:t>
-      </w:r>
-    </w:p>
-    <w:p>
-      <w:pPr>
-        <w:pStyle w:val="Prrafodelista"/>
-        <w:numPr>
-          <w:ilvl w:val="0"/>
-          <w:numId w:val="8"/>
-        </w:numPr>
-        <w:spacing w:after="60"/>
-      </w:pPr>
-      <w:r>
-        <w:t xml:space="preserve">Ves tu </w:t>
-      </w:r>
-      <w:r>
-        <w:rPr>
-          <w:b/>
-          <w:bCs/>
-        </w:rPr>
-        <w:t>nota</w:t>
-      </w:r>
-      <w:r>
-        <w:t xml:space="preserve">, si </w:t>
-      </w:r>
-      <w:r>
-        <w:rPr>
-          <w:b/>
-          <w:bCs/>
-        </w:rPr>
-        <w:t>aprobaste</w:t>
-      </w:r>
-      <w:r>
-        <w:t xml:space="preserve"> y qué preguntas acertaste.</w:t>
+        <w:t xml:space="preserve">Al terminar, toca </w:t>
+      </w:r>
+      <w:r>
+        <w:rPr>
+          <w:b/>
+          <w:bCs/>
+        </w:rPr>
+        <w:t>Marcar teoría como leída</w:t>
+      </w:r>
+      <w:r>
+        <w:t>. Con eso se habilita la práctica.</w:t>
       </w:r>
     </w:p>
     <w:p>
@@ -5808,10 +5943,10 @@
         </w:rPr>
         <w:lastRenderedPageBreak/>
         <w:drawing>
-          <wp:inline distT="0" distB="0" distL="0" distR="0" wp14:anchorId="2CF2F39E" wp14:editId="7F78BDF9">
+          <wp:inline distT="0" distB="0" distL="0" distR="0" wp14:anchorId="37FBBCA3" wp14:editId="4F80918E">
             <wp:extent cx="5334000" cy="4876800"/>
             <wp:effectExtent l="0" t="0" r="0" b="0"/>
-            <wp:docPr id="16" name="41_practica" descr="Figura 15. Práctica en curso." title="Figura 15. Práctica en curso."/>
+            <wp:docPr id="16" name="40_teoria" descr="Figura 15. Teoría de una lección." title="Figura 15. Teoría de una lección."/>
             <wp:cNvGraphicFramePr>
               <a:graphicFrameLocks xmlns:a="http://schemas.openxmlformats.org/drawingml/2006/main" noChangeAspect="1"/>
             </wp:cNvGraphicFramePr>
@@ -5860,7 +5995,223 @@
           <w:sz w:val="18"/>
           <w:szCs w:val="18"/>
         </w:rPr>
-        <w:t>Figura 15. Práctica en curso.</w:t>
+        <w:t>Figura 15. Teoría de una lección.</w:t>
+      </w:r>
+    </w:p>
+    <w:p>
+      <w:pPr>
+        <w:pStyle w:val="Ttulo2"/>
+      </w:pPr>
+      <w:bookmarkStart w:id="24" w:name="_Toc242805122"/>
+      <w:r>
+        <w:t>7.3 Hacer la práctica</w:t>
+      </w:r>
+      <w:bookmarkEnd w:id="24"/>
+    </w:p>
+    <w:p>
+      <w:pPr>
+        <w:spacing w:after="120"/>
+      </w:pPr>
+      <w:r>
+        <w:t xml:space="preserve">Cada lección indica cómo es su práctica, por ejemplo: </w:t>
+      </w:r>
+      <w:r>
+        <w:rPr>
+          <w:b/>
+          <w:bCs/>
+        </w:rPr>
+        <w:t>Práctica: 4 preguntas al azar de un banco de 6 · aprueba con 75%.</w:t>
+      </w:r>
+    </w:p>
+    <w:p>
+      <w:pPr>
+        <w:pStyle w:val="Prrafodelista"/>
+        <w:numPr>
+          <w:ilvl w:val="0"/>
+          <w:numId w:val="8"/>
+        </w:numPr>
+        <w:spacing w:after="60"/>
+      </w:pPr>
+      <w:r>
+        <w:t xml:space="preserve">Toca </w:t>
+      </w:r>
+      <w:r>
+        <w:rPr>
+          <w:b/>
+          <w:bCs/>
+        </w:rPr>
+        <w:t>Iniciar práctica</w:t>
+      </w:r>
+      <w:r>
+        <w:t>.</w:t>
+      </w:r>
+    </w:p>
+    <w:p>
+      <w:pPr>
+        <w:pStyle w:val="Prrafodelista"/>
+        <w:numPr>
+          <w:ilvl w:val="0"/>
+          <w:numId w:val="8"/>
+        </w:numPr>
+        <w:spacing w:after="60"/>
+      </w:pPr>
+      <w:r>
+        <w:t xml:space="preserve">Responde </w:t>
+      </w:r>
+      <w:r>
+        <w:rPr>
+          <w:b/>
+          <w:bCs/>
+        </w:rPr>
+        <w:t>una pregunta a la vez</w:t>
+      </w:r>
+      <w:r>
+        <w:t xml:space="preserve">. Tienes un tiempo por pregunta que ves en la barra. En las preguntas de varias respuestas, marca </w:t>
+      </w:r>
+      <w:r>
+        <w:rPr>
+          <w:b/>
+          <w:bCs/>
+        </w:rPr>
+        <w:t>todas</w:t>
+      </w:r>
+      <w:r>
+        <w:t xml:space="preserve"> las correctas.</w:t>
+      </w:r>
+    </w:p>
+    <w:p>
+      <w:pPr>
+        <w:pStyle w:val="Prrafodelista"/>
+        <w:numPr>
+          <w:ilvl w:val="0"/>
+          <w:numId w:val="8"/>
+        </w:numPr>
+        <w:spacing w:after="60"/>
+      </w:pPr>
+      <w:r>
+        <w:t xml:space="preserve">Toca </w:t>
+      </w:r>
+      <w:r>
+        <w:rPr>
+          <w:b/>
+          <w:bCs/>
+        </w:rPr>
+        <w:t>Siguiente pregunta</w:t>
+      </w:r>
+      <w:r>
+        <w:t>. No puedes avanzar sin elegir una respuesta.</w:t>
+      </w:r>
+    </w:p>
+    <w:p>
+      <w:pPr>
+        <w:pStyle w:val="Prrafodelista"/>
+        <w:numPr>
+          <w:ilvl w:val="0"/>
+          <w:numId w:val="8"/>
+        </w:numPr>
+        <w:spacing w:after="60"/>
+      </w:pPr>
+      <w:r>
+        <w:t>Al terminar se envían tus respuestas y el sistema calcula la nota.</w:t>
+      </w:r>
+    </w:p>
+    <w:p>
+      <w:pPr>
+        <w:pStyle w:val="Prrafodelista"/>
+        <w:numPr>
+          <w:ilvl w:val="0"/>
+          <w:numId w:val="8"/>
+        </w:numPr>
+        <w:spacing w:after="60"/>
+      </w:pPr>
+      <w:r>
+        <w:t xml:space="preserve">Ves tu </w:t>
+      </w:r>
+      <w:r>
+        <w:rPr>
+          <w:b/>
+          <w:bCs/>
+        </w:rPr>
+        <w:t>nota</w:t>
+      </w:r>
+      <w:r>
+        <w:t xml:space="preserve">, si </w:t>
+      </w:r>
+      <w:r>
+        <w:rPr>
+          <w:b/>
+          <w:bCs/>
+        </w:rPr>
+        <w:t>aprobaste</w:t>
+      </w:r>
+      <w:r>
+        <w:t xml:space="preserve"> y qué preguntas acertaste.</w:t>
+      </w:r>
+    </w:p>
+    <w:p>
+      <w:pPr>
+        <w:spacing w:before="120" w:after="60"/>
+        <w:jc w:val="center"/>
+      </w:pPr>
+      <w:r>
+        <w:rPr>
+          <w:noProof/>
+        </w:rPr>
+        <w:lastRenderedPageBreak/>
+        <w:drawing>
+          <wp:inline distT="0" distB="0" distL="0" distR="0" wp14:anchorId="125CD459" wp14:editId="0E4B130E">
+            <wp:extent cx="5334000" cy="4876800"/>
+            <wp:effectExtent l="0" t="0" r="0" b="0"/>
+            <wp:docPr id="17" name="41_practica" descr="Figura 16. Práctica en curso." title="Figura 16. Práctica en curso."/>
+            <wp:cNvGraphicFramePr>
+              <a:graphicFrameLocks xmlns:a="http://schemas.openxmlformats.org/drawingml/2006/main" noChangeAspect="1"/>
+            </wp:cNvGraphicFramePr>
+            <a:graphic xmlns:a="http://schemas.openxmlformats.org/drawingml/2006/main">
+              <a:graphicData uri="http://schemas.openxmlformats.org/drawingml/2006/picture">
+                <pic:pic xmlns:pic="http://schemas.openxmlformats.org/drawingml/2006/picture">
+                  <pic:nvPicPr>
+                    <pic:cNvPr id="0" name=""/>
+                    <pic:cNvPicPr>
+                      <a:picLocks noChangeAspect="1" noChangeArrowheads="1"/>
+                    </pic:cNvPicPr>
+                  </pic:nvPicPr>
+                  <pic:blipFill>
+                    <a:blip r:embed="rId23"/>
+                    <a:srcRect/>
+                    <a:stretch>
+                      <a:fillRect/>
+                    </a:stretch>
+                  </pic:blipFill>
+                  <pic:spPr bwMode="auto">
+                    <a:xfrm>
+                      <a:off x="0" y="0"/>
+                      <a:ext cx="5334000" cy="4876800"/>
+                    </a:xfrm>
+                    <a:prstGeom prst="rect">
+                      <a:avLst/>
+                    </a:prstGeom>
+                  </pic:spPr>
+                </pic:pic>
+              </a:graphicData>
+            </a:graphic>
+          </wp:inline>
+        </w:drawing>
+      </w:r>
+    </w:p>
+    <w:p>
+      <w:pPr>
+        <w:spacing w:after="240"/>
+        <w:jc w:val="center"/>
+      </w:pPr>
+      <w:r>
+        <w:rPr>
+          <w:i/>
+          <w:iCs/>
+          <w:color w:val="5B6B7C"/>
+          <w:sz w:val="18"/>
+          <w:szCs w:val="18"/>
+        </w:rPr>
+        <w:t>Figura 16. Práctica en curso.</w:t>
       </w:r>
     </w:p>
     <w:p>
@@ -5943,11 +6294,11 @@
       <w:pPr>
         <w:pStyle w:val="Ttulo2"/>
       </w:pPr>
-      <w:bookmarkStart w:id="23" w:name="_Toc242803891"/>
+      <w:bookmarkStart w:id="25" w:name="_Toc242805123"/>
       <w:r>
         <w:t>7.4 Si algo no aparece</w:t>
       </w:r>
-      <w:bookmarkEnd w:id="23"/>
+      <w:bookmarkEnd w:id="25"/>
     </w:p>
     <w:p>
       <w:pPr>
@@ -5993,12 +6344,12 @@
         <w:pStyle w:val="Ttulo1"/>
         <w:pageBreakBefore/>
       </w:pPr>
-      <w:bookmarkStart w:id="24" w:name="_Toc242803892"/>
+      <w:bookmarkStart w:id="26" w:name="_Toc242805124"/>
       <w:r>
         <w:lastRenderedPageBreak/>
         <w:t>8. Preguntas frecuentes</w:t>
       </w:r>
-      <w:bookmarkEnd w:id="24"/>
+      <w:bookmarkEnd w:id="26"/>
     </w:p>
     <w:p>
       <w:pPr>
@@ -6091,10 +6442,10 @@
       </w:r>
     </w:p>
     <w:sectPr>
-      <w:headerReference w:type="default" r:id="rId23"/>
-      <w:footerReference w:type="default" r:id="rId24"/>
-      <w:headerReference w:type="first" r:id="rId25"/>
-      <w:footerReference w:type="first" r:id="rId26"/>
+      <w:headerReference w:type="default" r:id="rId24"/>
+      <w:footerReference w:type="default" r:id="rId25"/>
+      <w:headerReference w:type="first" r:id="rId26"/>
+      <w:footerReference w:type="first" r:id="rId27"/>
       <w:pgSz w:w="11906" w:h="16838"/>
       <w:pgMar w:top="1440" w:right="1440" w:bottom="1440" w:left="1440" w:header="708" w:footer="708" w:gutter="0"/>
       <w:cols w:space="720"/>
@@ -6284,10 +6635,10 @@
 <file path=word/numbering.xml><?xml version="1.0" encoding="utf-8"?>
 <w:numbering xmlns:wpc="http://schemas.microsoft.com/office/word/2010/wordprocessingCanvas" xmlns:cx="http://schemas.microsoft.com/office/drawing/2014/chartex" xmlns:cx1="http://schemas.microsoft.com/office/drawing/2015/9/8/chartex" xmlns:cx2="http://schemas.microsoft.com/office/drawing/2015/10/21/chartex" xmlns:cx3="http://schemas.microsoft.com/office/drawing/2016/5/9/chartex" xmlns:cx4="http://schemas.microsoft.com/office/drawing/2016/5/10/chartex" xmlns:cx5="http://schemas.microsoft.com/office/drawing/2016/5/11/chartex" xmlns:cx6="http://schemas.microsoft.com/office/drawing/2016/5/12/chartex" xmlns:cx7="http://schemas.microsoft.com/office/drawing/2016/5/13/chartex" xmlns:cx8="http://schemas.microsoft.com/office/drawing/2016/5/14/chartex" xmlns:mc="http://schemas.openxmlformats.org/markup-compatibility/2006" xmlns:aink="http://schemas.microsoft.com/office/drawing/2016/ink" xmlns:am3d="http://schemas.microsoft.com/office/drawing/2017/model3d" xmlns:o="urn:schemas-microsoft-com:office:office" xmlns:oel="http://schemas.microsoft.com/office/2019/extlst" xmlns:r="http://schemas.openxmlformats.org/officeDocument/2006/relationships" xmlns:m="http://schemas.openxmlformats.org/officeDocument/2006/math" xmlns:v="urn:schemas-microsoft-com:vml" xmlns:wp14="http://schemas.microsoft.com/office/word/2010/wordprocessingDrawing" xmlns:wp="http://schemas.openxmlformats.org/drawingml/2006/wordprocessingDrawing" xmlns:w10="urn:schemas-microsoft-com:office:word" xmlns:w="http://schemas.openxmlformats.org/wordprocessingml/2006/main" xmlns:w14="http://schemas.microsoft.com/office/word/2010/wordml" xmlns:w15="http://schemas.microsoft.com/office/word/2012/wordml" xmlns:w16cex="http://schemas.microsoft.com/office/word/2018/wordml/cex" xmlns:w16cid="http://schemas.microsoft.com/office/word/2016/wordml/cid" xmlns:w16="http://schemas.microsoft.com/office/word/2018/wordml" xmlns:w16du="http://schemas.microsoft.com/office/word/2023/wordml/word16du" xmlns:w16sdtdh="http://schemas.microsoft.com/office/word/2020/wordml/sdtdatahash" xmlns:w16sdtfl="http://schemas.microsoft.com/office/word/2024/wordml/sdtformatlock" xmlns:w16se="http://schemas.microsoft.com/office/word/2015/wordml/symex" xmlns:wpg="http://schemas.microsoft.com/office/word/2010/wordprocessingGroup" xmlns:wpi="http://schemas.microsoft.com/office/word/2010/wordprocessingInk" xmlns:wne="http://schemas.microsoft.com/office/word/2006/wordml" xmlns:wps="http://schemas.microsoft.com/office/word/2010/wordprocessingShape" mc:Ignorable="w14 w15 w16se w16cid w16 w16cex w16sdtdh w16sdtfl w16du wp14">
   <w:abstractNum w:abstractNumId="0" w15:restartNumberingAfterBreak="0">
-    <w:nsid w:val="07CE1820"/>
+    <w:nsid w:val="02720B09"/>
     <w:multiLevelType w:val="hybridMultilevel"/>
-    <w:tmpl w:val="620A8A14"/>
-    <w:lvl w:ilvl="0" w:tplc="AFB080B8">
+    <w:tmpl w:val="359E49E2"/>
+    <w:lvl w:ilvl="0" w:tplc="B7E42C86">
       <w:start w:val="1"/>
       <w:numFmt w:val="decimal"/>
       <w:lvlText w:val="%1."/>
@@ -6296,192 +6647,160 @@
         <w:ind w:left="720" w:hanging="360"/>
       </w:pPr>
     </w:lvl>
-    <w:lvl w:ilvl="1" w:tplc="A0461120">
+    <w:lvl w:ilvl="1" w:tplc="6F44EB70">
       <w:numFmt w:val="decimal"/>
       <w:lvlText w:val=""/>
       <w:lvlJc w:val="left"/>
     </w:lvl>
-    <w:lvl w:ilvl="2" w:tplc="62A23954">
+    <w:lvl w:ilvl="2" w:tplc="D1E6E792">
       <w:numFmt w:val="decimal"/>
       <w:lvlText w:val=""/>
       <w:lvlJc w:val="left"/>
     </w:lvl>
-    <w:lvl w:ilvl="3" w:tplc="B770EE98">
+    <w:lvl w:ilvl="3" w:tplc="50064DCC">
       <w:numFmt w:val="decimal"/>
       <w:lvlText w:val=""/>
       <w:lvlJc w:val="left"/>
     </w:lvl>
-    <w:lvl w:ilvl="4" w:tplc="F7EA7706">
+    <w:lvl w:ilvl="4" w:tplc="10C6EFA2">
       <w:numFmt w:val="decimal"/>
       <w:lvlText w:val=""/>
       <w:lvlJc w:val="left"/>
     </w:lvl>
-    <w:lvl w:ilvl="5" w:tplc="B85883DC">
+    <w:lvl w:ilvl="5" w:tplc="DB3E7002">
       <w:numFmt w:val="decimal"/>
       <w:lvlText w:val=""/>
       <w:lvlJc w:val="left"/>
     </w:lvl>
-    <w:lvl w:ilvl="6" w:tplc="00A4CFDA">
+    <w:lvl w:ilvl="6" w:tplc="5CF48428">
       <w:numFmt w:val="decimal"/>
       <w:lvlText w:val=""/>
       <w:lvlJc w:val="left"/>
     </w:lvl>
-    <w:lvl w:ilvl="7" w:tplc="9328EFD8">
+    <w:lvl w:ilvl="7" w:tplc="5F7460DA">
       <w:numFmt w:val="decimal"/>
       <w:lvlText w:val=""/>
       <w:lvlJc w:val="left"/>
     </w:lvl>
-    <w:lvl w:ilvl="8" w:tplc="B91848E4">
+    <w:lvl w:ilvl="8" w:tplc="0D14FB02">
       <w:numFmt w:val="decimal"/>
       <w:lvlText w:val=""/>
       <w:lvlJc w:val="left"/>
     </w:lvl>
   </w:abstractNum>
   <w:abstractNum w:abstractNumId="1" w15:restartNumberingAfterBreak="0">
-    <w:nsid w:val="07ED3111"/>
+    <w:nsid w:val="03BF7844"/>
     <w:multiLevelType w:val="hybridMultilevel"/>
-    <w:tmpl w:val="5FA49BC6"/>
-    <w:lvl w:ilvl="0" w:tplc="622800F8" w:tentative="1">
+    <w:tmpl w:val="58727050"/>
+    <w:lvl w:ilvl="0" w:tplc="181EAB7A">
       <w:start w:val="1"/>
-      <w:numFmt w:val="bullet"/>
-      <w:lvlText w:val="●"/>
+      <w:numFmt w:val="decimal"/>
+      <w:lvlText w:val="%1."/>
       <w:lvlJc w:val="left"/>
       <w:pPr>
         <w:ind w:left="720" w:hanging="360"/>
       </w:pPr>
     </w:lvl>
-    <w:lvl w:ilvl="1" w:tplc="93BE4EEC" w:tentative="1">
-      <w:start w:val="1"/>
-      <w:numFmt w:val="bullet"/>
-      <w:lvlText w:val="○"/>
-      <w:lvlJc w:val="left"/>
-      <w:pPr>
-        <w:ind w:left="1440" w:hanging="360"/>
-      </w:pPr>
-    </w:lvl>
-    <w:lvl w:ilvl="2" w:tplc="4746DA2E" w:tentative="1">
-      <w:start w:val="1"/>
-      <w:numFmt w:val="bullet"/>
-      <w:lvlText w:val="■"/>
-      <w:lvlJc w:val="left"/>
-      <w:pPr>
-        <w:ind w:left="2160" w:hanging="360"/>
-      </w:pPr>
-    </w:lvl>
-    <w:lvl w:ilvl="3" w:tplc="AE66297E" w:tentative="1">
-      <w:start w:val="1"/>
-      <w:numFmt w:val="bullet"/>
-      <w:lvlText w:val="●"/>
-      <w:lvlJc w:val="left"/>
-      <w:pPr>
-        <w:ind w:left="2880" w:hanging="360"/>
-      </w:pPr>
-    </w:lvl>
-    <w:lvl w:ilvl="4" w:tplc="46C68236" w:tentative="1">
-      <w:start w:val="1"/>
-      <w:numFmt w:val="bullet"/>
-      <w:lvlText w:val="○"/>
-      <w:lvlJc w:val="left"/>
-      <w:pPr>
-        <w:ind w:left="3600" w:hanging="360"/>
-      </w:pPr>
-    </w:lvl>
-    <w:lvl w:ilvl="5" w:tplc="F498088E" w:tentative="1">
-      <w:start w:val="1"/>
-      <w:numFmt w:val="bullet"/>
-      <w:lvlText w:val="■"/>
-      <w:lvlJc w:val="left"/>
-      <w:pPr>
-        <w:ind w:left="4320" w:hanging="360"/>
-      </w:pPr>
-    </w:lvl>
-    <w:lvl w:ilvl="6" w:tplc="9AFC40F6" w:tentative="1">
-      <w:start w:val="1"/>
-      <w:numFmt w:val="bullet"/>
-      <w:lvlText w:val="●"/>
-      <w:lvlJc w:val="left"/>
-      <w:pPr>
-        <w:ind w:left="5040" w:hanging="360"/>
-      </w:pPr>
-    </w:lvl>
-    <w:lvl w:ilvl="7" w:tplc="76449820" w:tentative="1">
-      <w:start w:val="1"/>
-      <w:numFmt w:val="bullet"/>
-      <w:lvlText w:val="●"/>
-      <w:lvlJc w:val="left"/>
-      <w:pPr>
-        <w:ind w:left="5760" w:hanging="360"/>
-      </w:pPr>
-    </w:lvl>
-    <w:lvl w:ilvl="8" w:tplc="A588EDF8" w:tentative="1">
-      <w:start w:val="1"/>
-      <w:numFmt w:val="bullet"/>
-      <w:lvlText w:val="●"/>
-      <w:lvlJc w:val="left"/>
-      <w:pPr>
-        <w:ind w:left="6480" w:hanging="360"/>
-      </w:pPr>
-    </w:lvl>
-  </w:abstractNum>
-  <w:abstractNum w:abstractNumId="2" w15:restartNumberingAfterBreak="0">
-    <w:nsid w:val="11965153"/>
-    <w:multiLevelType w:val="hybridMultilevel"/>
-    <w:tmpl w:val="416C4EFA"/>
-    <w:lvl w:ilvl="0" w:tplc="41A0E540">
-      <w:start w:val="1"/>
-      <w:numFmt w:val="bullet"/>
-      <w:lvlText w:val="•"/>
-      <w:lvlJc w:val="left"/>
-      <w:pPr>
-        <w:ind w:left="720" w:hanging="360"/>
-      </w:pPr>
-    </w:lvl>
-    <w:lvl w:ilvl="1" w:tplc="703289F4">
+    <w:lvl w:ilvl="1" w:tplc="0016B0CA">
       <w:numFmt w:val="decimal"/>
       <w:lvlText w:val=""/>
       <w:lvlJc w:val="left"/>
     </w:lvl>
-    <w:lvl w:ilvl="2" w:tplc="B6D214AE">
+    <w:lvl w:ilvl="2" w:tplc="E5A6AE40">
       <w:numFmt w:val="decimal"/>
       <w:lvlText w:val=""/>
       <w:lvlJc w:val="left"/>
     </w:lvl>
-    <w:lvl w:ilvl="3" w:tplc="D7FC8B6E">
+    <w:lvl w:ilvl="3" w:tplc="6A0E21C4">
       <w:numFmt w:val="decimal"/>
       <w:lvlText w:val=""/>
       <w:lvlJc w:val="left"/>
     </w:lvl>
-    <w:lvl w:ilvl="4" w:tplc="6ACA5FD0">
+    <w:lvl w:ilvl="4" w:tplc="E7E4CA42">
       <w:numFmt w:val="decimal"/>
       <w:lvlText w:val=""/>
       <w:lvlJc w:val="left"/>
     </w:lvl>
-    <w:lvl w:ilvl="5" w:tplc="0CAC7BEE">
+    <w:lvl w:ilvl="5" w:tplc="EE8E58DE">
       <w:numFmt w:val="decimal"/>
       <w:lvlText w:val=""/>
       <w:lvlJc w:val="left"/>
     </w:lvl>
-    <w:lvl w:ilvl="6" w:tplc="EF201C7A">
+    <w:lvl w:ilvl="6" w:tplc="B2388CF6">
       <w:numFmt w:val="decimal"/>
       <w:lvlText w:val=""/>
       <w:lvlJc w:val="left"/>
     </w:lvl>
-    <w:lvl w:ilvl="7" w:tplc="DA4AFB4E">
+    <w:lvl w:ilvl="7" w:tplc="3BD84356">
       <w:numFmt w:val="decimal"/>
       <w:lvlText w:val=""/>
       <w:lvlJc w:val="left"/>
     </w:lvl>
-    <w:lvl w:ilvl="8" w:tplc="6D1C4E32">
+    <w:lvl w:ilvl="8" w:tplc="9E3AB72E">
+      <w:numFmt w:val="decimal"/>
+      <w:lvlText w:val=""/>
+      <w:lvlJc w:val="left"/>
+    </w:lvl>
+  </w:abstractNum>
+  <w:abstractNum w:abstractNumId="2" w15:restartNumberingAfterBreak="0">
+    <w:nsid w:val="139A226B"/>
+    <w:multiLevelType w:val="hybridMultilevel"/>
+    <w:tmpl w:val="1AB6F810"/>
+    <w:lvl w:ilvl="0" w:tplc="FF6211B8">
+      <w:start w:val="1"/>
+      <w:numFmt w:val="decimal"/>
+      <w:lvlText w:val="%1."/>
+      <w:lvlJc w:val="left"/>
+      <w:pPr>
+        <w:ind w:left="720" w:hanging="360"/>
+      </w:pPr>
+    </w:lvl>
+    <w:lvl w:ilvl="1" w:tplc="02B2A22A">
+      <w:numFmt w:val="decimal"/>
+      <w:lvlText w:val=""/>
+      <w:lvlJc w:val="left"/>
+    </w:lvl>
+    <w:lvl w:ilvl="2" w:tplc="C8108766">
+      <w:numFmt w:val="decimal"/>
+      <w:lvlText w:val=""/>
+      <w:lvlJc w:val="left"/>
+    </w:lvl>
+    <w:lvl w:ilvl="3" w:tplc="E1A892F6">
+      <w:numFmt w:val="decimal"/>
+      <w:lvlText w:val=""/>
+      <w:lvlJc w:val="left"/>
+    </w:lvl>
+    <w:lvl w:ilvl="4" w:tplc="9116822E">
+      <w:numFmt w:val="decimal"/>
+      <w:lvlText w:val=""/>
+      <w:lvlJc w:val="left"/>
+    </w:lvl>
+    <w:lvl w:ilvl="5" w:tplc="A0B0F500">
+      <w:numFmt w:val="decimal"/>
+      <w:lvlText w:val=""/>
+      <w:lvlJc w:val="left"/>
+    </w:lvl>
+    <w:lvl w:ilvl="6" w:tplc="9D2062AE">
+      <w:numFmt w:val="decimal"/>
+      <w:lvlText w:val=""/>
+      <w:lvlJc w:val="left"/>
+    </w:lvl>
+    <w:lvl w:ilvl="7" w:tplc="123E34F6">
+      <w:numFmt w:val="decimal"/>
+      <w:lvlText w:val=""/>
+      <w:lvlJc w:val="left"/>
+    </w:lvl>
+    <w:lvl w:ilvl="8" w:tplc="1C6A73A4">
       <w:numFmt w:val="decimal"/>
       <w:lvlText w:val=""/>
       <w:lvlJc w:val="left"/>
     </w:lvl>
   </w:abstractNum>
   <w:abstractNum w:abstractNumId="3" w15:restartNumberingAfterBreak="0">
-    <w:nsid w:val="1C7E5143"/>
+    <w:nsid w:val="25207479"/>
     <w:multiLevelType w:val="hybridMultilevel"/>
-    <w:tmpl w:val="86C0F8E6"/>
-    <w:lvl w:ilvl="0" w:tplc="1A4C559A">
+    <w:tmpl w:val="2F263416"/>
+    <w:lvl w:ilvl="0" w:tplc="97D2E440">
       <w:start w:val="1"/>
       <w:numFmt w:val="decimal"/>
       <w:lvlText w:val="%1."/>
@@ -6490,106 +6809,106 @@
         <w:ind w:left="720" w:hanging="360"/>
       </w:pPr>
     </w:lvl>
-    <w:lvl w:ilvl="1" w:tplc="52C24C8E">
+    <w:lvl w:ilvl="1" w:tplc="132CECD8">
       <w:numFmt w:val="decimal"/>
       <w:lvlText w:val=""/>
       <w:lvlJc w:val="left"/>
     </w:lvl>
-    <w:lvl w:ilvl="2" w:tplc="75B2BE6C">
+    <w:lvl w:ilvl="2" w:tplc="9A16C324">
       <w:numFmt w:val="decimal"/>
       <w:lvlText w:val=""/>
       <w:lvlJc w:val="left"/>
     </w:lvl>
-    <w:lvl w:ilvl="3" w:tplc="D6DA2520">
+    <w:lvl w:ilvl="3" w:tplc="D94CEF04">
       <w:numFmt w:val="decimal"/>
       <w:lvlText w:val=""/>
       <w:lvlJc w:val="left"/>
     </w:lvl>
-    <w:lvl w:ilvl="4" w:tplc="C58E6AC0">
+    <w:lvl w:ilvl="4" w:tplc="EA9C1CCE">
       <w:numFmt w:val="decimal"/>
       <w:lvlText w:val=""/>
       <w:lvlJc w:val="left"/>
     </w:lvl>
-    <w:lvl w:ilvl="5" w:tplc="BA6AF710">
+    <w:lvl w:ilvl="5" w:tplc="909413D0">
       <w:numFmt w:val="decimal"/>
       <w:lvlText w:val=""/>
       <w:lvlJc w:val="left"/>
     </w:lvl>
-    <w:lvl w:ilvl="6" w:tplc="A1E2DAF0">
+    <w:lvl w:ilvl="6" w:tplc="8E56F9E8">
       <w:numFmt w:val="decimal"/>
       <w:lvlText w:val=""/>
       <w:lvlJc w:val="left"/>
     </w:lvl>
-    <w:lvl w:ilvl="7" w:tplc="B018134E">
+    <w:lvl w:ilvl="7" w:tplc="E32830AA">
       <w:numFmt w:val="decimal"/>
       <w:lvlText w:val=""/>
       <w:lvlJc w:val="left"/>
     </w:lvl>
-    <w:lvl w:ilvl="8" w:tplc="FCD2B7B4">
+    <w:lvl w:ilvl="8" w:tplc="60C03478">
       <w:numFmt w:val="decimal"/>
       <w:lvlText w:val=""/>
       <w:lvlJc w:val="left"/>
     </w:lvl>
   </w:abstractNum>
   <w:abstractNum w:abstractNumId="4" w15:restartNumberingAfterBreak="0">
-    <w:nsid w:val="2ED975AA"/>
+    <w:nsid w:val="27854FA0"/>
     <w:multiLevelType w:val="hybridMultilevel"/>
-    <w:tmpl w:val="905C8148"/>
-    <w:lvl w:ilvl="0" w:tplc="4962A952">
+    <w:tmpl w:val="C0A2A8D6"/>
+    <w:lvl w:ilvl="0" w:tplc="C596A6D6">
       <w:start w:val="1"/>
-      <w:numFmt w:val="decimal"/>
-      <w:lvlText w:val="%1."/>
+      <w:numFmt w:val="bullet"/>
+      <w:lvlText w:val="•"/>
       <w:lvlJc w:val="left"/>
       <w:pPr>
         <w:ind w:left="720" w:hanging="360"/>
       </w:pPr>
     </w:lvl>
-    <w:lvl w:ilvl="1" w:tplc="5C1AED78">
+    <w:lvl w:ilvl="1" w:tplc="1158E290">
       <w:numFmt w:val="decimal"/>
       <w:lvlText w:val=""/>
       <w:lvlJc w:val="left"/>
     </w:lvl>
-    <w:lvl w:ilvl="2" w:tplc="A93E3DEE">
+    <w:lvl w:ilvl="2" w:tplc="6DC8F942">
       <w:numFmt w:val="decimal"/>
       <w:lvlText w:val=""/>
       <w:lvlJc w:val="left"/>
     </w:lvl>
-    <w:lvl w:ilvl="3" w:tplc="1D408F7E">
+    <w:lvl w:ilvl="3" w:tplc="07D27230">
       <w:numFmt w:val="decimal"/>
       <w:lvlText w:val=""/>
       <w:lvlJc w:val="left"/>
     </w:lvl>
-    <w:lvl w:ilvl="4" w:tplc="534E7174">
+    <w:lvl w:ilvl="4" w:tplc="F440D89A">
       <w:numFmt w:val="decimal"/>
       <w:lvlText w:val=""/>
       <w:lvlJc w:val="left"/>
     </w:lvl>
-    <w:lvl w:ilvl="5" w:tplc="CE4E2F48">
+    <w:lvl w:ilvl="5" w:tplc="4D82F4DE">
       <w:numFmt w:val="decimal"/>
       <w:lvlText w:val=""/>
       <w:lvlJc w:val="left"/>
     </w:lvl>
-    <w:lvl w:ilvl="6" w:tplc="52643AAE">
+    <w:lvl w:ilvl="6" w:tplc="B3E00AD8">
       <w:numFmt w:val="decimal"/>
       <w:lvlText w:val=""/>
       <w:lvlJc w:val="left"/>
     </w:lvl>
-    <w:lvl w:ilvl="7" w:tplc="9A2ABDA2">
+    <w:lvl w:ilvl="7" w:tplc="4FFAC1C4">
       <w:numFmt w:val="decimal"/>
       <w:lvlText w:val=""/>
       <w:lvlJc w:val="left"/>
     </w:lvl>
-    <w:lvl w:ilvl="8" w:tplc="9402AE5C">
+    <w:lvl w:ilvl="8" w:tplc="06B2185E">
       <w:numFmt w:val="decimal"/>
       <w:lvlText w:val=""/>
       <w:lvlJc w:val="left"/>
     </w:lvl>
   </w:abstractNum>
   <w:abstractNum w:abstractNumId="5" w15:restartNumberingAfterBreak="0">
-    <w:nsid w:val="51A60671"/>
+    <w:nsid w:val="331F7B17"/>
     <w:multiLevelType w:val="hybridMultilevel"/>
-    <w:tmpl w:val="B1E6526C"/>
-    <w:lvl w:ilvl="0" w:tplc="5538DF7E">
+    <w:tmpl w:val="DD3009AC"/>
+    <w:lvl w:ilvl="0" w:tplc="8FD8F87E">
       <w:start w:val="1"/>
       <w:numFmt w:val="decimal"/>
       <w:lvlText w:val="%1."/>
@@ -6598,52 +6917,52 @@
         <w:ind w:left="720" w:hanging="360"/>
       </w:pPr>
     </w:lvl>
-    <w:lvl w:ilvl="1" w:tplc="8EC8141E">
+    <w:lvl w:ilvl="1" w:tplc="B83A3C8A">
       <w:numFmt w:val="decimal"/>
       <w:lvlText w:val=""/>
       <w:lvlJc w:val="left"/>
     </w:lvl>
-    <w:lvl w:ilvl="2" w:tplc="0938F956">
+    <w:lvl w:ilvl="2" w:tplc="E982CB82">
       <w:numFmt w:val="decimal"/>
       <w:lvlText w:val=""/>
       <w:lvlJc w:val="left"/>
     </w:lvl>
-    <w:lvl w:ilvl="3" w:tplc="ED66E6DC">
+    <w:lvl w:ilvl="3" w:tplc="E98A0A52">
       <w:numFmt w:val="decimal"/>
       <w:lvlText w:val=""/>
       <w:lvlJc w:val="left"/>
     </w:lvl>
-    <w:lvl w:ilvl="4" w:tplc="44CCBE24">
+    <w:lvl w:ilvl="4" w:tplc="3FF03230">
       <w:numFmt w:val="decimal"/>
       <w:lvlText w:val=""/>
       <w:lvlJc w:val="left"/>
     </w:lvl>
-    <w:lvl w:ilvl="5" w:tplc="1E3AD6C8">
+    <w:lvl w:ilvl="5" w:tplc="C51C44C4">
       <w:numFmt w:val="decimal"/>
       <w:lvlText w:val=""/>
       <w:lvlJc w:val="left"/>
     </w:lvl>
-    <w:lvl w:ilvl="6" w:tplc="7248D47E">
+    <w:lvl w:ilvl="6" w:tplc="65A61888">
       <w:numFmt w:val="decimal"/>
       <w:lvlText w:val=""/>
       <w:lvlJc w:val="left"/>
     </w:lvl>
-    <w:lvl w:ilvl="7" w:tplc="978A1EDE">
+    <w:lvl w:ilvl="7" w:tplc="6C6ABC56">
       <w:numFmt w:val="decimal"/>
       <w:lvlText w:val=""/>
       <w:lvlJc w:val="left"/>
     </w:lvl>
-    <w:lvl w:ilvl="8" w:tplc="9EA00E12">
+    <w:lvl w:ilvl="8" w:tplc="CCA8D55A">
       <w:numFmt w:val="decimal"/>
       <w:lvlText w:val=""/>
       <w:lvlJc w:val="left"/>
     </w:lvl>
   </w:abstractNum>
   <w:abstractNum w:abstractNumId="6" w15:restartNumberingAfterBreak="0">
-    <w:nsid w:val="552E0754"/>
+    <w:nsid w:val="34A3214C"/>
     <w:multiLevelType w:val="hybridMultilevel"/>
-    <w:tmpl w:val="C998794E"/>
-    <w:lvl w:ilvl="0" w:tplc="2ADE164E">
+    <w:tmpl w:val="22B6FE70"/>
+    <w:lvl w:ilvl="0" w:tplc="9D66D0B2">
       <w:start w:val="1"/>
       <w:numFmt w:val="decimal"/>
       <w:lvlText w:val="%1."/>
@@ -6652,145 +6971,177 @@
         <w:ind w:left="720" w:hanging="360"/>
       </w:pPr>
     </w:lvl>
-    <w:lvl w:ilvl="1" w:tplc="F9D4C074">
+    <w:lvl w:ilvl="1" w:tplc="C876F21E">
       <w:numFmt w:val="decimal"/>
       <w:lvlText w:val=""/>
       <w:lvlJc w:val="left"/>
     </w:lvl>
-    <w:lvl w:ilvl="2" w:tplc="D73CA304">
+    <w:lvl w:ilvl="2" w:tplc="ED3A7E1C">
       <w:numFmt w:val="decimal"/>
       <w:lvlText w:val=""/>
       <w:lvlJc w:val="left"/>
     </w:lvl>
-    <w:lvl w:ilvl="3" w:tplc="4CE0B8F6">
+    <w:lvl w:ilvl="3" w:tplc="8F36AB30">
       <w:numFmt w:val="decimal"/>
       <w:lvlText w:val=""/>
       <w:lvlJc w:val="left"/>
     </w:lvl>
-    <w:lvl w:ilvl="4" w:tplc="38A45464">
+    <w:lvl w:ilvl="4" w:tplc="FED00146">
       <w:numFmt w:val="decimal"/>
       <w:lvlText w:val=""/>
       <w:lvlJc w:val="left"/>
     </w:lvl>
-    <w:lvl w:ilvl="5" w:tplc="F6E4137A">
+    <w:lvl w:ilvl="5" w:tplc="1BF880D6">
       <w:numFmt w:val="decimal"/>
       <w:lvlText w:val=""/>
       <w:lvlJc w:val="left"/>
     </w:lvl>
-    <w:lvl w:ilvl="6" w:tplc="B3F0943E">
+    <w:lvl w:ilvl="6" w:tplc="0E5A1902">
       <w:numFmt w:val="decimal"/>
       <w:lvlText w:val=""/>
       <w:lvlJc w:val="left"/>
     </w:lvl>
-    <w:lvl w:ilvl="7" w:tplc="A0C8C114">
+    <w:lvl w:ilvl="7" w:tplc="D2629950">
       <w:numFmt w:val="decimal"/>
       <w:lvlText w:val=""/>
       <w:lvlJc w:val="left"/>
     </w:lvl>
-    <w:lvl w:ilvl="8" w:tplc="9B464460">
+    <w:lvl w:ilvl="8" w:tplc="0D6085DA">
       <w:numFmt w:val="decimal"/>
       <w:lvlText w:val=""/>
       <w:lvlJc w:val="left"/>
     </w:lvl>
   </w:abstractNum>
   <w:abstractNum w:abstractNumId="7" w15:restartNumberingAfterBreak="0">
-    <w:nsid w:val="75E76583"/>
+    <w:nsid w:val="49227178"/>
     <w:multiLevelType w:val="hybridMultilevel"/>
-    <w:tmpl w:val="4B708464"/>
-    <w:lvl w:ilvl="0" w:tplc="57340154">
+    <w:tmpl w:val="02304FC6"/>
+    <w:lvl w:ilvl="0" w:tplc="C17075D2" w:tentative="1">
       <w:start w:val="1"/>
-      <w:numFmt w:val="decimal"/>
-      <w:lvlText w:val="%1."/>
+      <w:numFmt w:val="bullet"/>
+      <w:lvlText w:val="●"/>
       <w:lvlJc w:val="left"/>
       <w:pPr>
         <w:ind w:left="720" w:hanging="360"/>
       </w:pPr>
     </w:lvl>
-    <w:lvl w:ilvl="1" w:tplc="5EE4CC4A">
-      <w:numFmt w:val="decimal"/>
-      <w:lvlText w:val=""/>
+    <w:lvl w:ilvl="1" w:tplc="6518D400" w:tentative="1">
+      <w:start w:val="1"/>
+      <w:numFmt w:val="bullet"/>
+      <w:lvlText w:val="○"/>
       <w:lvlJc w:val="left"/>
+      <w:pPr>
+        <w:ind w:left="1440" w:hanging="360"/>
+      </w:pPr>
     </w:lvl>
-    <w:lvl w:ilvl="2" w:tplc="B4F6F8E4">
-      <w:numFmt w:val="decimal"/>
-      <w:lvlText w:val=""/>
+    <w:lvl w:ilvl="2" w:tplc="8EAA9B16" w:tentative="1">
+      <w:start w:val="1"/>
+      <w:numFmt w:val="bullet"/>
+      <w:lvlText w:val="■"/>
       <w:lvlJc w:val="left"/>
+      <w:pPr>
+        <w:ind w:left="2160" w:hanging="360"/>
+      </w:pPr>
     </w:lvl>
-    <w:lvl w:ilvl="3" w:tplc="0F42C7F8">
-      <w:numFmt w:val="decimal"/>
-      <w:lvlText w:val=""/>
+    <w:lvl w:ilvl="3" w:tplc="291C73A0" w:tentative="1">
+      <w:start w:val="1"/>
+      <w:numFmt w:val="bullet"/>
+      <w:lvlText w:val="●"/>
       <w:lvlJc w:val="left"/>
+      <w:pPr>
+        <w:ind w:left="2880" w:hanging="360"/>
+      </w:pPr>
     </w:lvl>
-    <w:lvl w:ilvl="4" w:tplc="0636C966">
-      <w:numFmt w:val="decimal"/>
-      <w:lvlText w:val=""/>
+    <w:lvl w:ilvl="4" w:tplc="48B0DA5E" w:tentative="1">
+      <w:start w:val="1"/>
+      <w:numFmt w:val="bullet"/>
+      <w:lvlText w:val="○"/>
       <w:lvlJc w:val="left"/>
+      <w:pPr>
+        <w:ind w:left="3600" w:hanging="360"/>
+      </w:pPr>
     </w:lvl>
-    <w:lvl w:ilvl="5" w:tplc="02586928">
-      <w:numFmt w:val="decimal"/>
-      <w:lvlText w:val=""/>
+    <w:lvl w:ilvl="5" w:tplc="D6449208" w:tentative="1">
+      <w:start w:val="1"/>
+      <w:numFmt w:val="bullet"/>
+      <w:lvlText w:val="■"/>
       <w:lvlJc w:val="left"/>
+      <w:pPr>
+        <w:ind w:left="4320" w:hanging="360"/>
+      </w:pPr>
     </w:lvl>
-    <w:lvl w:ilvl="6" w:tplc="B268C6C8">
-      <w:numFmt w:val="decimal"/>
-      <w:lvlText w:val=""/>
+    <w:lvl w:ilvl="6" w:tplc="BD3ACDC4" w:tentative="1">
+      <w:start w:val="1"/>
+      <w:numFmt w:val="bullet"/>
+      <w:lvlText w:val="●"/>
       <w:lvlJc w:val="left"/>
+      <w:pPr>
+        <w:ind w:left="5040" w:hanging="360"/>
+      </w:pPr>
     </w:lvl>
-    <w:lvl w:ilvl="7" w:tplc="97BCA522">
-      <w:numFmt w:val="decimal"/>
-      <w:lvlText w:val=""/>
+    <w:lvl w:ilvl="7" w:tplc="9638600A" w:tentative="1">
+      <w:start w:val="1"/>
+      <w:numFmt w:val="bullet"/>
+      <w:lvlText w:val="●"/>
       <w:lvlJc w:val="left"/>
+      <w:pPr>
+        <w:ind w:left="5760" w:hanging="360"/>
+      </w:pPr>
     </w:lvl>
-    <w:lvl w:ilvl="8" w:tplc="8D16FC58">
-      <w:numFmt w:val="decimal"/>
-      <w:lvlText w:val=""/>
+    <w:lvl w:ilvl="8" w:tplc="EB04A554" w:tentative="1">
+      <w:start w:val="1"/>
+      <w:numFmt w:val="bullet"/>
+      <w:lvlText w:val="●"/>
       <w:lvlJc w:val="left"/>
+      <w:pPr>
+        <w:ind w:left="6480" w:hanging="360"/>
+      </w:pPr>
     </w:lvl>
   </w:abstractNum>
-  <w:num w:numId="1" w16cid:durableId="1456370707">
+  <w:num w:numId="1" w16cid:durableId="357586539">
+    <w:abstractNumId w:val="7"/>
+    <w:lvlOverride w:ilvl="0">
+      <w:startOverride w:val="1"/>
+    </w:lvlOverride>
+  </w:num>
+  <w:num w:numId="2" w16cid:durableId="967323113">
+    <w:abstractNumId w:val="4"/>
+    <w:lvlOverride w:ilvl="0">
+      <w:startOverride w:val="1"/>
+    </w:lvlOverride>
+  </w:num>
+  <w:num w:numId="3" w16cid:durableId="1876382088">
+    <w:abstractNumId w:val="0"/>
+    <w:lvlOverride w:ilvl="0">
+      <w:startOverride w:val="1"/>
+    </w:lvlOverride>
+  </w:num>
+  <w:num w:numId="4" w16cid:durableId="223492071">
+    <w:abstractNumId w:val="6"/>
+    <w:lvlOverride w:ilvl="0">
+      <w:startOverride w:val="1"/>
+    </w:lvlOverride>
+  </w:num>
+  <w:num w:numId="5" w16cid:durableId="286934410">
+    <w:abstractNumId w:val="2"/>
+    <w:lvlOverride w:ilvl="0">
+      <w:startOverride w:val="1"/>
+    </w:lvlOverride>
+  </w:num>
+  <w:num w:numId="6" w16cid:durableId="438767325">
     <w:abstractNumId w:val="1"/>
     <w:lvlOverride w:ilvl="0">
       <w:startOverride w:val="1"/>
     </w:lvlOverride>
   </w:num>
-  <w:num w:numId="2" w16cid:durableId="2052607849">
-    <w:abstractNumId w:val="2"/>
-    <w:lvlOverride w:ilvl="0">
-      <w:startOverride w:val="1"/>
-    </w:lvlOverride>
-  </w:num>
-  <w:num w:numId="3" w16cid:durableId="114103986">
-    <w:abstractNumId w:val="4"/>
-    <w:lvlOverride w:ilvl="0">
-      <w:startOverride w:val="1"/>
-    </w:lvlOverride>
-  </w:num>
-  <w:num w:numId="4" w16cid:durableId="1990354641">
-    <w:abstractNumId w:val="0"/>
-    <w:lvlOverride w:ilvl="0">
-      <w:startOverride w:val="1"/>
-    </w:lvlOverride>
-  </w:num>
-  <w:num w:numId="5" w16cid:durableId="664633108">
+  <w:num w:numId="7" w16cid:durableId="129057306">
     <w:abstractNumId w:val="3"/>
     <w:lvlOverride w:ilvl="0">
       <w:startOverride w:val="1"/>
     </w:lvlOverride>
   </w:num>
-  <w:num w:numId="6" w16cid:durableId="648872877">
+  <w:num w:numId="8" w16cid:durableId="1344867544">
     <w:abstractNumId w:val="5"/>
-    <w:lvlOverride w:ilvl="0">
-      <w:startOverride w:val="1"/>
-    </w:lvlOverride>
-  </w:num>
-  <w:num w:numId="7" w16cid:durableId="408889478">
-    <w:abstractNumId w:val="6"/>
-    <w:lvlOverride w:ilvl="0">
-      <w:startOverride w:val="1"/>
-    </w:lvlOverride>
-  </w:num>
-  <w:num w:numId="8" w16cid:durableId="1052848098">
-    <w:abstractNumId w:val="7"/>
     <w:lvlOverride w:ilvl="0">
       <w:startOverride w:val="1"/>
     </w:lvlOverride>
@@ -7433,7 +7784,7 @@
     <w:autoRedefine/>
     <w:uiPriority w:val="39"/>
     <w:unhideWhenUsed/>
-    <w:rsid w:val="0042640A"/>
+    <w:rsid w:val="00357A9C"/>
     <w:pPr>
       <w:spacing w:after="100"/>
     </w:pPr>
@@ -7445,7 +7796,7 @@
     <w:autoRedefine/>
     <w:uiPriority w:val="39"/>
     <w:unhideWhenUsed/>
-    <w:rsid w:val="0042640A"/>
+    <w:rsid w:val="00357A9C"/>
     <w:pPr>
       <w:spacing w:after="100"/>
       <w:ind w:left="220"/>

</xml_diff>